<commit_message>
Rewrite MILP investigation report with detailed prose and embedded figures
</commit_message>
<xml_diff>
--- a/revisions/MILP_vs_heuristic_analysis.docx
+++ b/revisions/MILP_vs_heuristic_analysis.docx
@@ -12,7 +12,7 @@
     </w:p>
     <w:p>
       <w:r>
-        <w:t>Investigation requested on the accuracy figures of the data-aware scheduling paper: find every point where a heuristic beats the MILP, rerun the MILP on the same instances, and determine the cause. All numbers below are from data/results/*.csv and the diagnostic reruns in this folder (diagnose_milp_gap.py, fix_flagged_milp.py, milp_diagnostics.csv).</w:t>
+        <w:t>This review re-examined the accuracy results reported in the data-aware scheduling paper with the specific aim of explaining the few cases where a heuristic appears to exceed the MILP. The approach was to enumerate every same-instance comparison in which the heuristic score was higher, rerun the MILP on those exact instances, and trace the discrepancy to its source. All values and comparisons referenced here come from data/results/*.csv and from the diagnostic reruns produced in this folder (diagnose_milp_gap.py, fix_flagged_milp.py, milp_diagnostics.csv).</w:t>
       </w:r>
     </w:p>
     <w:p>
@@ -20,12 +20,12 @@
         <w:pStyle w:val="Heading1"/>
       </w:pPr>
       <w:r>
-        <w:t>1. Where the heuristics scored higher</w:t>
+        <w:t>1. Instances where a heuristic exceeded the MILP</w:t>
       </w:r>
     </w:p>
     <w:p>
       <w:r>
-        <w:t>Figure 4 (deadline slack) and Figure 5 (federation size) each show a few points where the greedy marker sits just above the MILP marker. Checking every sweep CSV row (not only the plotted means), the full list of same-instance points where a comparable method outscored the MILP is:</w:t>
+        <w:t>In Figure 4 (deadline slack) and Figure 5 (federation size), a small number of plotted points place the greedy marker slightly above the MILP marker. To rule out averaging artifacts, the review inspected the full sweep CSVs at the row level, rather than relying on the plotted means. The following table lists every case where a like-for-like heuristic scored above the MILP on the same generated instance.</w:t>
       </w:r>
     </w:p>
     <w:tbl>
@@ -108,6 +108,38 @@
           <w:tcPr>
             <w:tcW w:type="dxa" w:w="1728"/>
           </w:tcPr>
+          <w:p/>
+        </w:tc>
+        <w:tc>
+          <w:tcPr>
+            <w:tcW w:type="dxa" w:w="1728"/>
+          </w:tcPr>
+          <w:p/>
+        </w:tc>
+        <w:tc>
+          <w:tcPr>
+            <w:tcW w:type="dxa" w:w="1728"/>
+          </w:tcPr>
+          <w:p/>
+        </w:tc>
+        <w:tc>
+          <w:tcPr>
+            <w:tcW w:type="dxa" w:w="1728"/>
+          </w:tcPr>
+          <w:p/>
+        </w:tc>
+      </w:tr>
+      <w:tr>
+        <w:tc>
+          <w:tcPr>
+            <w:tcW w:type="dxa" w:w="1728"/>
+          </w:tcPr>
+          <w:p/>
+        </w:tc>
+        <w:tc>
+          <w:tcPr>
+            <w:tcW w:type="dxa" w:w="1728"/>
+          </w:tcPr>
           <w:p>
             <w:r>
               <w:t>alpha = 1.2</w:t>
@@ -118,6 +150,38 @@
           <w:tcPr>
             <w:tcW w:type="dxa" w:w="1728"/>
           </w:tcPr>
+          <w:p/>
+        </w:tc>
+        <w:tc>
+          <w:tcPr>
+            <w:tcW w:type="dxa" w:w="1728"/>
+          </w:tcPr>
+          <w:p/>
+        </w:tc>
+        <w:tc>
+          <w:tcPr>
+            <w:tcW w:type="dxa" w:w="1728"/>
+          </w:tcPr>
+          <w:p/>
+        </w:tc>
+      </w:tr>
+      <w:tr>
+        <w:tc>
+          <w:tcPr>
+            <w:tcW w:type="dxa" w:w="1728"/>
+          </w:tcPr>
+          <w:p/>
+        </w:tc>
+        <w:tc>
+          <w:tcPr>
+            <w:tcW w:type="dxa" w:w="1728"/>
+          </w:tcPr>
+          <w:p/>
+        </w:tc>
+        <w:tc>
+          <w:tcPr>
+            <w:tcW w:type="dxa" w:w="1728"/>
+          </w:tcPr>
           <w:p>
             <w:r>
               <w:t>2</w:t>
@@ -128,6 +192,38 @@
           <w:tcPr>
             <w:tcW w:type="dxa" w:w="1728"/>
           </w:tcPr>
+          <w:p/>
+        </w:tc>
+        <w:tc>
+          <w:tcPr>
+            <w:tcW w:type="dxa" w:w="1728"/>
+          </w:tcPr>
+          <w:p/>
+        </w:tc>
+      </w:tr>
+      <w:tr>
+        <w:tc>
+          <w:tcPr>
+            <w:tcW w:type="dxa" w:w="1728"/>
+          </w:tcPr>
+          <w:p/>
+        </w:tc>
+        <w:tc>
+          <w:tcPr>
+            <w:tcW w:type="dxa" w:w="1728"/>
+          </w:tcPr>
+          <w:p/>
+        </w:tc>
+        <w:tc>
+          <w:tcPr>
+            <w:tcW w:type="dxa" w:w="1728"/>
+          </w:tcPr>
+          <w:p/>
+        </w:tc>
+        <w:tc>
+          <w:tcPr>
+            <w:tcW w:type="dxa" w:w="1728"/>
+          </w:tcPr>
           <w:p>
             <w:r>
               <w:t>1.4422</w:t>
@@ -138,6 +234,38 @@
           <w:tcPr>
             <w:tcW w:type="dxa" w:w="1728"/>
           </w:tcPr>
+          <w:p/>
+        </w:tc>
+      </w:tr>
+      <w:tr>
+        <w:tc>
+          <w:tcPr>
+            <w:tcW w:type="dxa" w:w="1728"/>
+          </w:tcPr>
+          <w:p/>
+        </w:tc>
+        <w:tc>
+          <w:tcPr>
+            <w:tcW w:type="dxa" w:w="1728"/>
+          </w:tcPr>
+          <w:p/>
+        </w:tc>
+        <w:tc>
+          <w:tcPr>
+            <w:tcW w:type="dxa" w:w="1728"/>
+          </w:tcPr>
+          <w:p/>
+        </w:tc>
+        <w:tc>
+          <w:tcPr>
+            <w:tcW w:type="dxa" w:w="1728"/>
+          </w:tcPr>
+          <w:p/>
+        </w:tc>
+        <w:tc>
+          <w:tcPr>
+            <w:tcW w:type="dxa" w:w="1728"/>
+          </w:tcPr>
           <w:p>
             <w:r>
               <w:t>1.4383</w:t>
@@ -160,6 +288,38 @@
           <w:tcPr>
             <w:tcW w:type="dxa" w:w="1728"/>
           </w:tcPr>
+          <w:p/>
+        </w:tc>
+        <w:tc>
+          <w:tcPr>
+            <w:tcW w:type="dxa" w:w="1728"/>
+          </w:tcPr>
+          <w:p/>
+        </w:tc>
+        <w:tc>
+          <w:tcPr>
+            <w:tcW w:type="dxa" w:w="1728"/>
+          </w:tcPr>
+          <w:p/>
+        </w:tc>
+        <w:tc>
+          <w:tcPr>
+            <w:tcW w:type="dxa" w:w="1728"/>
+          </w:tcPr>
+          <w:p/>
+        </w:tc>
+      </w:tr>
+      <w:tr>
+        <w:tc>
+          <w:tcPr>
+            <w:tcW w:type="dxa" w:w="1728"/>
+          </w:tcPr>
+          <w:p/>
+        </w:tc>
+        <w:tc>
+          <w:tcPr>
+            <w:tcW w:type="dxa" w:w="1728"/>
+          </w:tcPr>
           <w:p>
             <w:r>
               <w:t>alpha = 1.2</w:t>
@@ -170,6 +330,38 @@
           <w:tcPr>
             <w:tcW w:type="dxa" w:w="1728"/>
           </w:tcPr>
+          <w:p/>
+        </w:tc>
+        <w:tc>
+          <w:tcPr>
+            <w:tcW w:type="dxa" w:w="1728"/>
+          </w:tcPr>
+          <w:p/>
+        </w:tc>
+        <w:tc>
+          <w:tcPr>
+            <w:tcW w:type="dxa" w:w="1728"/>
+          </w:tcPr>
+          <w:p/>
+        </w:tc>
+      </w:tr>
+      <w:tr>
+        <w:tc>
+          <w:tcPr>
+            <w:tcW w:type="dxa" w:w="1728"/>
+          </w:tcPr>
+          <w:p/>
+        </w:tc>
+        <w:tc>
+          <w:tcPr>
+            <w:tcW w:type="dxa" w:w="1728"/>
+          </w:tcPr>
+          <w:p/>
+        </w:tc>
+        <w:tc>
+          <w:tcPr>
+            <w:tcW w:type="dxa" w:w="1728"/>
+          </w:tcPr>
           <w:p>
             <w:r>
               <w:t>3</w:t>
@@ -180,6 +372,38 @@
           <w:tcPr>
             <w:tcW w:type="dxa" w:w="1728"/>
           </w:tcPr>
+          <w:p/>
+        </w:tc>
+        <w:tc>
+          <w:tcPr>
+            <w:tcW w:type="dxa" w:w="1728"/>
+          </w:tcPr>
+          <w:p/>
+        </w:tc>
+      </w:tr>
+      <w:tr>
+        <w:tc>
+          <w:tcPr>
+            <w:tcW w:type="dxa" w:w="1728"/>
+          </w:tcPr>
+          <w:p/>
+        </w:tc>
+        <w:tc>
+          <w:tcPr>
+            <w:tcW w:type="dxa" w:w="1728"/>
+          </w:tcPr>
+          <w:p/>
+        </w:tc>
+        <w:tc>
+          <w:tcPr>
+            <w:tcW w:type="dxa" w:w="1728"/>
+          </w:tcPr>
+          <w:p/>
+        </w:tc>
+        <w:tc>
+          <w:tcPr>
+            <w:tcW w:type="dxa" w:w="1728"/>
+          </w:tcPr>
           <w:p>
             <w:r>
               <w:t>1.4226</w:t>
@@ -190,6 +414,38 @@
           <w:tcPr>
             <w:tcW w:type="dxa" w:w="1728"/>
           </w:tcPr>
+          <w:p/>
+        </w:tc>
+      </w:tr>
+      <w:tr>
+        <w:tc>
+          <w:tcPr>
+            <w:tcW w:type="dxa" w:w="1728"/>
+          </w:tcPr>
+          <w:p/>
+        </w:tc>
+        <w:tc>
+          <w:tcPr>
+            <w:tcW w:type="dxa" w:w="1728"/>
+          </w:tcPr>
+          <w:p/>
+        </w:tc>
+        <w:tc>
+          <w:tcPr>
+            <w:tcW w:type="dxa" w:w="1728"/>
+          </w:tcPr>
+          <w:p/>
+        </w:tc>
+        <w:tc>
+          <w:tcPr>
+            <w:tcW w:type="dxa" w:w="1728"/>
+          </w:tcPr>
+          <w:p/>
+        </w:tc>
+        <w:tc>
+          <w:tcPr>
+            <w:tcW w:type="dxa" w:w="1728"/>
+          </w:tcPr>
           <w:p>
             <w:r>
               <w:t>1.4040</w:t>
@@ -212,6 +468,38 @@
           <w:tcPr>
             <w:tcW w:type="dxa" w:w="1728"/>
           </w:tcPr>
+          <w:p/>
+        </w:tc>
+        <w:tc>
+          <w:tcPr>
+            <w:tcW w:type="dxa" w:w="1728"/>
+          </w:tcPr>
+          <w:p/>
+        </w:tc>
+        <w:tc>
+          <w:tcPr>
+            <w:tcW w:type="dxa" w:w="1728"/>
+          </w:tcPr>
+          <w:p/>
+        </w:tc>
+        <w:tc>
+          <w:tcPr>
+            <w:tcW w:type="dxa" w:w="1728"/>
+          </w:tcPr>
+          <w:p/>
+        </w:tc>
+      </w:tr>
+      <w:tr>
+        <w:tc>
+          <w:tcPr>
+            <w:tcW w:type="dxa" w:w="1728"/>
+          </w:tcPr>
+          <w:p/>
+        </w:tc>
+        <w:tc>
+          <w:tcPr>
+            <w:tcW w:type="dxa" w:w="1728"/>
+          </w:tcPr>
           <w:p>
             <w:r>
               <w:t>alpha = 1.2</w:t>
@@ -222,6 +510,38 @@
           <w:tcPr>
             <w:tcW w:type="dxa" w:w="1728"/>
           </w:tcPr>
+          <w:p/>
+        </w:tc>
+        <w:tc>
+          <w:tcPr>
+            <w:tcW w:type="dxa" w:w="1728"/>
+          </w:tcPr>
+          <w:p/>
+        </w:tc>
+        <w:tc>
+          <w:tcPr>
+            <w:tcW w:type="dxa" w:w="1728"/>
+          </w:tcPr>
+          <w:p/>
+        </w:tc>
+      </w:tr>
+      <w:tr>
+        <w:tc>
+          <w:tcPr>
+            <w:tcW w:type="dxa" w:w="1728"/>
+          </w:tcPr>
+          <w:p/>
+        </w:tc>
+        <w:tc>
+          <w:tcPr>
+            <w:tcW w:type="dxa" w:w="1728"/>
+          </w:tcPr>
+          <w:p/>
+        </w:tc>
+        <w:tc>
+          <w:tcPr>
+            <w:tcW w:type="dxa" w:w="1728"/>
+          </w:tcPr>
           <w:p>
             <w:r>
               <w:t>4</w:t>
@@ -232,6 +552,38 @@
           <w:tcPr>
             <w:tcW w:type="dxa" w:w="1728"/>
           </w:tcPr>
+          <w:p/>
+        </w:tc>
+        <w:tc>
+          <w:tcPr>
+            <w:tcW w:type="dxa" w:w="1728"/>
+          </w:tcPr>
+          <w:p/>
+        </w:tc>
+      </w:tr>
+      <w:tr>
+        <w:tc>
+          <w:tcPr>
+            <w:tcW w:type="dxa" w:w="1728"/>
+          </w:tcPr>
+          <w:p/>
+        </w:tc>
+        <w:tc>
+          <w:tcPr>
+            <w:tcW w:type="dxa" w:w="1728"/>
+          </w:tcPr>
+          <w:p/>
+        </w:tc>
+        <w:tc>
+          <w:tcPr>
+            <w:tcW w:type="dxa" w:w="1728"/>
+          </w:tcPr>
+          <w:p/>
+        </w:tc>
+        <w:tc>
+          <w:tcPr>
+            <w:tcW w:type="dxa" w:w="1728"/>
+          </w:tcPr>
           <w:p>
             <w:r>
               <w:t>1.4515</w:t>
@@ -242,6 +594,38 @@
           <w:tcPr>
             <w:tcW w:type="dxa" w:w="1728"/>
           </w:tcPr>
+          <w:p/>
+        </w:tc>
+      </w:tr>
+      <w:tr>
+        <w:tc>
+          <w:tcPr>
+            <w:tcW w:type="dxa" w:w="1728"/>
+          </w:tcPr>
+          <w:p/>
+        </w:tc>
+        <w:tc>
+          <w:tcPr>
+            <w:tcW w:type="dxa" w:w="1728"/>
+          </w:tcPr>
+          <w:p/>
+        </w:tc>
+        <w:tc>
+          <w:tcPr>
+            <w:tcW w:type="dxa" w:w="1728"/>
+          </w:tcPr>
+          <w:p/>
+        </w:tc>
+        <w:tc>
+          <w:tcPr>
+            <w:tcW w:type="dxa" w:w="1728"/>
+          </w:tcPr>
+          <w:p/>
+        </w:tc>
+        <w:tc>
+          <w:tcPr>
+            <w:tcW w:type="dxa" w:w="1728"/>
+          </w:tcPr>
           <w:p>
             <w:r>
               <w:t>1.4481</w:t>
@@ -264,6 +648,38 @@
           <w:tcPr>
             <w:tcW w:type="dxa" w:w="1728"/>
           </w:tcPr>
+          <w:p/>
+        </w:tc>
+        <w:tc>
+          <w:tcPr>
+            <w:tcW w:type="dxa" w:w="1728"/>
+          </w:tcPr>
+          <w:p/>
+        </w:tc>
+        <w:tc>
+          <w:tcPr>
+            <w:tcW w:type="dxa" w:w="1728"/>
+          </w:tcPr>
+          <w:p/>
+        </w:tc>
+        <w:tc>
+          <w:tcPr>
+            <w:tcW w:type="dxa" w:w="1728"/>
+          </w:tcPr>
+          <w:p/>
+        </w:tc>
+      </w:tr>
+      <w:tr>
+        <w:tc>
+          <w:tcPr>
+            <w:tcW w:type="dxa" w:w="1728"/>
+          </w:tcPr>
+          <w:p/>
+        </w:tc>
+        <w:tc>
+          <w:tcPr>
+            <w:tcW w:type="dxa" w:w="1728"/>
+          </w:tcPr>
           <w:p>
             <w:r>
               <w:t>alpha = 1.3</w:t>
@@ -274,6 +690,38 @@
           <w:tcPr>
             <w:tcW w:type="dxa" w:w="1728"/>
           </w:tcPr>
+          <w:p/>
+        </w:tc>
+        <w:tc>
+          <w:tcPr>
+            <w:tcW w:type="dxa" w:w="1728"/>
+          </w:tcPr>
+          <w:p/>
+        </w:tc>
+        <w:tc>
+          <w:tcPr>
+            <w:tcW w:type="dxa" w:w="1728"/>
+          </w:tcPr>
+          <w:p/>
+        </w:tc>
+      </w:tr>
+      <w:tr>
+        <w:tc>
+          <w:tcPr>
+            <w:tcW w:type="dxa" w:w="1728"/>
+          </w:tcPr>
+          <w:p/>
+        </w:tc>
+        <w:tc>
+          <w:tcPr>
+            <w:tcW w:type="dxa" w:w="1728"/>
+          </w:tcPr>
+          <w:p/>
+        </w:tc>
+        <w:tc>
+          <w:tcPr>
+            <w:tcW w:type="dxa" w:w="1728"/>
+          </w:tcPr>
           <w:p>
             <w:r>
               <w:t>3</w:t>
@@ -284,6 +732,38 @@
           <w:tcPr>
             <w:tcW w:type="dxa" w:w="1728"/>
           </w:tcPr>
+          <w:p/>
+        </w:tc>
+        <w:tc>
+          <w:tcPr>
+            <w:tcW w:type="dxa" w:w="1728"/>
+          </w:tcPr>
+          <w:p/>
+        </w:tc>
+      </w:tr>
+      <w:tr>
+        <w:tc>
+          <w:tcPr>
+            <w:tcW w:type="dxa" w:w="1728"/>
+          </w:tcPr>
+          <w:p/>
+        </w:tc>
+        <w:tc>
+          <w:tcPr>
+            <w:tcW w:type="dxa" w:w="1728"/>
+          </w:tcPr>
+          <w:p/>
+        </w:tc>
+        <w:tc>
+          <w:tcPr>
+            <w:tcW w:type="dxa" w:w="1728"/>
+          </w:tcPr>
+          <w:p/>
+        </w:tc>
+        <w:tc>
+          <w:tcPr>
+            <w:tcW w:type="dxa" w:w="1728"/>
+          </w:tcPr>
           <w:p>
             <w:r>
               <w:t>1.4226</w:t>
@@ -294,6 +774,38 @@
           <w:tcPr>
             <w:tcW w:type="dxa" w:w="1728"/>
           </w:tcPr>
+          <w:p/>
+        </w:tc>
+      </w:tr>
+      <w:tr>
+        <w:tc>
+          <w:tcPr>
+            <w:tcW w:type="dxa" w:w="1728"/>
+          </w:tcPr>
+          <w:p/>
+        </w:tc>
+        <w:tc>
+          <w:tcPr>
+            <w:tcW w:type="dxa" w:w="1728"/>
+          </w:tcPr>
+          <w:p/>
+        </w:tc>
+        <w:tc>
+          <w:tcPr>
+            <w:tcW w:type="dxa" w:w="1728"/>
+          </w:tcPr>
+          <w:p/>
+        </w:tc>
+        <w:tc>
+          <w:tcPr>
+            <w:tcW w:type="dxa" w:w="1728"/>
+          </w:tcPr>
+          <w:p/>
+        </w:tc>
+        <w:tc>
+          <w:tcPr>
+            <w:tcW w:type="dxa" w:w="1728"/>
+          </w:tcPr>
           <w:p>
             <w:r>
               <w:t>1.4165</w:t>
@@ -316,6 +828,38 @@
           <w:tcPr>
             <w:tcW w:type="dxa" w:w="1728"/>
           </w:tcPr>
+          <w:p/>
+        </w:tc>
+        <w:tc>
+          <w:tcPr>
+            <w:tcW w:type="dxa" w:w="1728"/>
+          </w:tcPr>
+          <w:p/>
+        </w:tc>
+        <w:tc>
+          <w:tcPr>
+            <w:tcW w:type="dxa" w:w="1728"/>
+          </w:tcPr>
+          <w:p/>
+        </w:tc>
+        <w:tc>
+          <w:tcPr>
+            <w:tcW w:type="dxa" w:w="1728"/>
+          </w:tcPr>
+          <w:p/>
+        </w:tc>
+      </w:tr>
+      <w:tr>
+        <w:tc>
+          <w:tcPr>
+            <w:tcW w:type="dxa" w:w="1728"/>
+          </w:tcPr>
+          <w:p/>
+        </w:tc>
+        <w:tc>
+          <w:tcPr>
+            <w:tcW w:type="dxa" w:w="1728"/>
+          </w:tcPr>
           <w:p>
             <w:r>
               <w:t>alpha = 1.5</w:t>
@@ -326,6 +870,38 @@
           <w:tcPr>
             <w:tcW w:type="dxa" w:w="1728"/>
           </w:tcPr>
+          <w:p/>
+        </w:tc>
+        <w:tc>
+          <w:tcPr>
+            <w:tcW w:type="dxa" w:w="1728"/>
+          </w:tcPr>
+          <w:p/>
+        </w:tc>
+        <w:tc>
+          <w:tcPr>
+            <w:tcW w:type="dxa" w:w="1728"/>
+          </w:tcPr>
+          <w:p/>
+        </w:tc>
+      </w:tr>
+      <w:tr>
+        <w:tc>
+          <w:tcPr>
+            <w:tcW w:type="dxa" w:w="1728"/>
+          </w:tcPr>
+          <w:p/>
+        </w:tc>
+        <w:tc>
+          <w:tcPr>
+            <w:tcW w:type="dxa" w:w="1728"/>
+          </w:tcPr>
+          <w:p/>
+        </w:tc>
+        <w:tc>
+          <w:tcPr>
+            <w:tcW w:type="dxa" w:w="1728"/>
+          </w:tcPr>
           <w:p>
             <w:r>
               <w:t>1</w:t>
@@ -336,6 +912,38 @@
           <w:tcPr>
             <w:tcW w:type="dxa" w:w="1728"/>
           </w:tcPr>
+          <w:p/>
+        </w:tc>
+        <w:tc>
+          <w:tcPr>
+            <w:tcW w:type="dxa" w:w="1728"/>
+          </w:tcPr>
+          <w:p/>
+        </w:tc>
+      </w:tr>
+      <w:tr>
+        <w:tc>
+          <w:tcPr>
+            <w:tcW w:type="dxa" w:w="1728"/>
+          </w:tcPr>
+          <w:p/>
+        </w:tc>
+        <w:tc>
+          <w:tcPr>
+            <w:tcW w:type="dxa" w:w="1728"/>
+          </w:tcPr>
+          <w:p/>
+        </w:tc>
+        <w:tc>
+          <w:tcPr>
+            <w:tcW w:type="dxa" w:w="1728"/>
+          </w:tcPr>
+          <w:p/>
+        </w:tc>
+        <w:tc>
+          <w:tcPr>
+            <w:tcW w:type="dxa" w:w="1728"/>
+          </w:tcPr>
           <w:p>
             <w:r>
               <w:t>1.4370</w:t>
@@ -346,6 +954,38 @@
           <w:tcPr>
             <w:tcW w:type="dxa" w:w="1728"/>
           </w:tcPr>
+          <w:p/>
+        </w:tc>
+      </w:tr>
+      <w:tr>
+        <w:tc>
+          <w:tcPr>
+            <w:tcW w:type="dxa" w:w="1728"/>
+          </w:tcPr>
+          <w:p/>
+        </w:tc>
+        <w:tc>
+          <w:tcPr>
+            <w:tcW w:type="dxa" w:w="1728"/>
+          </w:tcPr>
+          <w:p/>
+        </w:tc>
+        <w:tc>
+          <w:tcPr>
+            <w:tcW w:type="dxa" w:w="1728"/>
+          </w:tcPr>
+          <w:p/>
+        </w:tc>
+        <w:tc>
+          <w:tcPr>
+            <w:tcW w:type="dxa" w:w="1728"/>
+          </w:tcPr>
+          <w:p/>
+        </w:tc>
+        <w:tc>
+          <w:tcPr>
+            <w:tcW w:type="dxa" w:w="1728"/>
+          </w:tcPr>
           <w:p>
             <w:r>
               <w:t>1.4369</w:t>
@@ -368,6 +1008,38 @@
           <w:tcPr>
             <w:tcW w:type="dxa" w:w="1728"/>
           </w:tcPr>
+          <w:p/>
+        </w:tc>
+        <w:tc>
+          <w:tcPr>
+            <w:tcW w:type="dxa" w:w="1728"/>
+          </w:tcPr>
+          <w:p/>
+        </w:tc>
+        <w:tc>
+          <w:tcPr>
+            <w:tcW w:type="dxa" w:w="1728"/>
+          </w:tcPr>
+          <w:p/>
+        </w:tc>
+        <w:tc>
+          <w:tcPr>
+            <w:tcW w:type="dxa" w:w="1728"/>
+          </w:tcPr>
+          <w:p/>
+        </w:tc>
+      </w:tr>
+      <w:tr>
+        <w:tc>
+          <w:tcPr>
+            <w:tcW w:type="dxa" w:w="1728"/>
+          </w:tcPr>
+          <w:p/>
+        </w:tc>
+        <w:tc>
+          <w:tcPr>
+            <w:tcW w:type="dxa" w:w="1728"/>
+          </w:tcPr>
           <w:p>
             <w:r>
               <w:t>N = 10</w:t>
@@ -378,6 +1050,38 @@
           <w:tcPr>
             <w:tcW w:type="dxa" w:w="1728"/>
           </w:tcPr>
+          <w:p/>
+        </w:tc>
+        <w:tc>
+          <w:tcPr>
+            <w:tcW w:type="dxa" w:w="1728"/>
+          </w:tcPr>
+          <w:p/>
+        </w:tc>
+        <w:tc>
+          <w:tcPr>
+            <w:tcW w:type="dxa" w:w="1728"/>
+          </w:tcPr>
+          <w:p/>
+        </w:tc>
+      </w:tr>
+      <w:tr>
+        <w:tc>
+          <w:tcPr>
+            <w:tcW w:type="dxa" w:w="1728"/>
+          </w:tcPr>
+          <w:p/>
+        </w:tc>
+        <w:tc>
+          <w:tcPr>
+            <w:tcW w:type="dxa" w:w="1728"/>
+          </w:tcPr>
+          <w:p/>
+        </w:tc>
+        <w:tc>
+          <w:tcPr>
+            <w:tcW w:type="dxa" w:w="1728"/>
+          </w:tcPr>
           <w:p>
             <w:r>
               <w:t>0</w:t>
@@ -388,6 +1092,38 @@
           <w:tcPr>
             <w:tcW w:type="dxa" w:w="1728"/>
           </w:tcPr>
+          <w:p/>
+        </w:tc>
+        <w:tc>
+          <w:tcPr>
+            <w:tcW w:type="dxa" w:w="1728"/>
+          </w:tcPr>
+          <w:p/>
+        </w:tc>
+      </w:tr>
+      <w:tr>
+        <w:tc>
+          <w:tcPr>
+            <w:tcW w:type="dxa" w:w="1728"/>
+          </w:tcPr>
+          <w:p/>
+        </w:tc>
+        <w:tc>
+          <w:tcPr>
+            <w:tcW w:type="dxa" w:w="1728"/>
+          </w:tcPr>
+          <w:p/>
+        </w:tc>
+        <w:tc>
+          <w:tcPr>
+            <w:tcW w:type="dxa" w:w="1728"/>
+          </w:tcPr>
+          <w:p/>
+        </w:tc>
+        <w:tc>
+          <w:tcPr>
+            <w:tcW w:type="dxa" w:w="1728"/>
+          </w:tcPr>
           <w:p>
             <w:r>
               <w:t>1.3464</w:t>
@@ -398,6 +1134,38 @@
           <w:tcPr>
             <w:tcW w:type="dxa" w:w="1728"/>
           </w:tcPr>
+          <w:p/>
+        </w:tc>
+      </w:tr>
+      <w:tr>
+        <w:tc>
+          <w:tcPr>
+            <w:tcW w:type="dxa" w:w="1728"/>
+          </w:tcPr>
+          <w:p/>
+        </w:tc>
+        <w:tc>
+          <w:tcPr>
+            <w:tcW w:type="dxa" w:w="1728"/>
+          </w:tcPr>
+          <w:p/>
+        </w:tc>
+        <w:tc>
+          <w:tcPr>
+            <w:tcW w:type="dxa" w:w="1728"/>
+          </w:tcPr>
+          <w:p/>
+        </w:tc>
+        <w:tc>
+          <w:tcPr>
+            <w:tcW w:type="dxa" w:w="1728"/>
+          </w:tcPr>
+          <w:p/>
+        </w:tc>
+        <w:tc>
+          <w:tcPr>
+            <w:tcW w:type="dxa" w:w="1728"/>
+          </w:tcPr>
           <w:p>
             <w:r>
               <w:t>1.3412</w:t>
@@ -420,6 +1188,38 @@
           <w:tcPr>
             <w:tcW w:type="dxa" w:w="1728"/>
           </w:tcPr>
+          <w:p/>
+        </w:tc>
+        <w:tc>
+          <w:tcPr>
+            <w:tcW w:type="dxa" w:w="1728"/>
+          </w:tcPr>
+          <w:p/>
+        </w:tc>
+        <w:tc>
+          <w:tcPr>
+            <w:tcW w:type="dxa" w:w="1728"/>
+          </w:tcPr>
+          <w:p/>
+        </w:tc>
+        <w:tc>
+          <w:tcPr>
+            <w:tcW w:type="dxa" w:w="1728"/>
+          </w:tcPr>
+          <w:p/>
+        </w:tc>
+      </w:tr>
+      <w:tr>
+        <w:tc>
+          <w:tcPr>
+            <w:tcW w:type="dxa" w:w="1728"/>
+          </w:tcPr>
+          <w:p/>
+        </w:tc>
+        <w:tc>
+          <w:tcPr>
+            <w:tcW w:type="dxa" w:w="1728"/>
+          </w:tcPr>
           <w:p>
             <w:r>
               <w:t>N = 10</w:t>
@@ -430,6 +1230,38 @@
           <w:tcPr>
             <w:tcW w:type="dxa" w:w="1728"/>
           </w:tcPr>
+          <w:p/>
+        </w:tc>
+        <w:tc>
+          <w:tcPr>
+            <w:tcW w:type="dxa" w:w="1728"/>
+          </w:tcPr>
+          <w:p/>
+        </w:tc>
+        <w:tc>
+          <w:tcPr>
+            <w:tcW w:type="dxa" w:w="1728"/>
+          </w:tcPr>
+          <w:p/>
+        </w:tc>
+      </w:tr>
+      <w:tr>
+        <w:tc>
+          <w:tcPr>
+            <w:tcW w:type="dxa" w:w="1728"/>
+          </w:tcPr>
+          <w:p/>
+        </w:tc>
+        <w:tc>
+          <w:tcPr>
+            <w:tcW w:type="dxa" w:w="1728"/>
+          </w:tcPr>
+          <w:p/>
+        </w:tc>
+        <w:tc>
+          <w:tcPr>
+            <w:tcW w:type="dxa" w:w="1728"/>
+          </w:tcPr>
           <w:p>
             <w:r>
               <w:t>3</w:t>
@@ -440,6 +1272,38 @@
           <w:tcPr>
             <w:tcW w:type="dxa" w:w="1728"/>
           </w:tcPr>
+          <w:p/>
+        </w:tc>
+        <w:tc>
+          <w:tcPr>
+            <w:tcW w:type="dxa" w:w="1728"/>
+          </w:tcPr>
+          <w:p/>
+        </w:tc>
+      </w:tr>
+      <w:tr>
+        <w:tc>
+          <w:tcPr>
+            <w:tcW w:type="dxa" w:w="1728"/>
+          </w:tcPr>
+          <w:p/>
+        </w:tc>
+        <w:tc>
+          <w:tcPr>
+            <w:tcW w:type="dxa" w:w="1728"/>
+          </w:tcPr>
+          <w:p/>
+        </w:tc>
+        <w:tc>
+          <w:tcPr>
+            <w:tcW w:type="dxa" w:w="1728"/>
+          </w:tcPr>
+          <w:p/>
+        </w:tc>
+        <w:tc>
+          <w:tcPr>
+            <w:tcW w:type="dxa" w:w="1728"/>
+          </w:tcPr>
           <w:p>
             <w:r>
               <w:t>1.4044</w:t>
@@ -450,6 +1314,38 @@
           <w:tcPr>
             <w:tcW w:type="dxa" w:w="1728"/>
           </w:tcPr>
+          <w:p/>
+        </w:tc>
+      </w:tr>
+      <w:tr>
+        <w:tc>
+          <w:tcPr>
+            <w:tcW w:type="dxa" w:w="1728"/>
+          </w:tcPr>
+          <w:p/>
+        </w:tc>
+        <w:tc>
+          <w:tcPr>
+            <w:tcW w:type="dxa" w:w="1728"/>
+          </w:tcPr>
+          <w:p/>
+        </w:tc>
+        <w:tc>
+          <w:tcPr>
+            <w:tcW w:type="dxa" w:w="1728"/>
+          </w:tcPr>
+          <w:p/>
+        </w:tc>
+        <w:tc>
+          <w:tcPr>
+            <w:tcW w:type="dxa" w:w="1728"/>
+          </w:tcPr>
+          <w:p/>
+        </w:tc>
+        <w:tc>
+          <w:tcPr>
+            <w:tcW w:type="dxa" w:w="1728"/>
+          </w:tcPr>
           <w:p>
             <w:r>
               <w:t>1.4043</w:t>
@@ -472,6 +1368,38 @@
           <w:tcPr>
             <w:tcW w:type="dxa" w:w="1728"/>
           </w:tcPr>
+          <w:p/>
+        </w:tc>
+        <w:tc>
+          <w:tcPr>
+            <w:tcW w:type="dxa" w:w="1728"/>
+          </w:tcPr>
+          <w:p/>
+        </w:tc>
+        <w:tc>
+          <w:tcPr>
+            <w:tcW w:type="dxa" w:w="1728"/>
+          </w:tcPr>
+          <w:p/>
+        </w:tc>
+        <w:tc>
+          <w:tcPr>
+            <w:tcW w:type="dxa" w:w="1728"/>
+          </w:tcPr>
+          <w:p/>
+        </w:tc>
+      </w:tr>
+      <w:tr>
+        <w:tc>
+          <w:tcPr>
+            <w:tcW w:type="dxa" w:w="1728"/>
+          </w:tcPr>
+          <w:p/>
+        </w:tc>
+        <w:tc>
+          <w:tcPr>
+            <w:tcW w:type="dxa" w:w="1728"/>
+          </w:tcPr>
           <w:p>
             <w:r>
               <w:t>n = 100</w:t>
@@ -482,6 +1410,38 @@
           <w:tcPr>
             <w:tcW w:type="dxa" w:w="1728"/>
           </w:tcPr>
+          <w:p/>
+        </w:tc>
+        <w:tc>
+          <w:tcPr>
+            <w:tcW w:type="dxa" w:w="1728"/>
+          </w:tcPr>
+          <w:p/>
+        </w:tc>
+        <w:tc>
+          <w:tcPr>
+            <w:tcW w:type="dxa" w:w="1728"/>
+          </w:tcPr>
+          <w:p/>
+        </w:tc>
+      </w:tr>
+      <w:tr>
+        <w:tc>
+          <w:tcPr>
+            <w:tcW w:type="dxa" w:w="1728"/>
+          </w:tcPr>
+          <w:p/>
+        </w:tc>
+        <w:tc>
+          <w:tcPr>
+            <w:tcW w:type="dxa" w:w="1728"/>
+          </w:tcPr>
+          <w:p/>
+        </w:tc>
+        <w:tc>
+          <w:tcPr>
+            <w:tcW w:type="dxa" w:w="1728"/>
+          </w:tcPr>
           <w:p>
             <w:r>
               <w:t>4</w:t>
@@ -492,6 +1452,38 @@
           <w:tcPr>
             <w:tcW w:type="dxa" w:w="1728"/>
           </w:tcPr>
+          <w:p/>
+        </w:tc>
+        <w:tc>
+          <w:tcPr>
+            <w:tcW w:type="dxa" w:w="1728"/>
+          </w:tcPr>
+          <w:p/>
+        </w:tc>
+      </w:tr>
+      <w:tr>
+        <w:tc>
+          <w:tcPr>
+            <w:tcW w:type="dxa" w:w="1728"/>
+          </w:tcPr>
+          <w:p/>
+        </w:tc>
+        <w:tc>
+          <w:tcPr>
+            <w:tcW w:type="dxa" w:w="1728"/>
+          </w:tcPr>
+          <w:p/>
+        </w:tc>
+        <w:tc>
+          <w:tcPr>
+            <w:tcW w:type="dxa" w:w="1728"/>
+          </w:tcPr>
+          <w:p/>
+        </w:tc>
+        <w:tc>
+          <w:tcPr>
+            <w:tcW w:type="dxa" w:w="1728"/>
+          </w:tcPr>
           <w:p>
             <w:r>
               <w:t>1.4322</w:t>
@@ -502,6 +1494,38 @@
           <w:tcPr>
             <w:tcW w:type="dxa" w:w="1728"/>
           </w:tcPr>
+          <w:p/>
+        </w:tc>
+      </w:tr>
+      <w:tr>
+        <w:tc>
+          <w:tcPr>
+            <w:tcW w:type="dxa" w:w="1728"/>
+          </w:tcPr>
+          <w:p/>
+        </w:tc>
+        <w:tc>
+          <w:tcPr>
+            <w:tcW w:type="dxa" w:w="1728"/>
+          </w:tcPr>
+          <w:p/>
+        </w:tc>
+        <w:tc>
+          <w:tcPr>
+            <w:tcW w:type="dxa" w:w="1728"/>
+          </w:tcPr>
+          <w:p/>
+        </w:tc>
+        <w:tc>
+          <w:tcPr>
+            <w:tcW w:type="dxa" w:w="1728"/>
+          </w:tcPr>
+          <w:p/>
+        </w:tc>
+        <w:tc>
+          <w:tcPr>
+            <w:tcW w:type="dxa" w:w="1728"/>
+          </w:tcPr>
           <w:p>
             <w:r>
               <w:t>1.4276</w:t>
@@ -524,6 +1548,38 @@
           <w:tcPr>
             <w:tcW w:type="dxa" w:w="1728"/>
           </w:tcPr>
+          <w:p/>
+        </w:tc>
+        <w:tc>
+          <w:tcPr>
+            <w:tcW w:type="dxa" w:w="1728"/>
+          </w:tcPr>
+          <w:p/>
+        </w:tc>
+        <w:tc>
+          <w:tcPr>
+            <w:tcW w:type="dxa" w:w="1728"/>
+          </w:tcPr>
+          <w:p/>
+        </w:tc>
+        <w:tc>
+          <w:tcPr>
+            <w:tcW w:type="dxa" w:w="1728"/>
+          </w:tcPr>
+          <w:p/>
+        </w:tc>
+      </w:tr>
+      <w:tr>
+        <w:tc>
+          <w:tcPr>
+            <w:tcW w:type="dxa" w:w="1728"/>
+          </w:tcPr>
+          <w:p/>
+        </w:tc>
+        <w:tc>
+          <w:tcPr>
+            <w:tcW w:type="dxa" w:w="1728"/>
+          </w:tcPr>
           <w:p>
             <w:r>
               <w:t>all rates</w:t>
@@ -534,6 +1590,38 @@
           <w:tcPr>
             <w:tcW w:type="dxa" w:w="1728"/>
           </w:tcPr>
+          <w:p/>
+        </w:tc>
+        <w:tc>
+          <w:tcPr>
+            <w:tcW w:type="dxa" w:w="1728"/>
+          </w:tcPr>
+          <w:p/>
+        </w:tc>
+        <w:tc>
+          <w:tcPr>
+            <w:tcW w:type="dxa" w:w="1728"/>
+          </w:tcPr>
+          <w:p/>
+        </w:tc>
+      </w:tr>
+      <w:tr>
+        <w:tc>
+          <w:tcPr>
+            <w:tcW w:type="dxa" w:w="1728"/>
+          </w:tcPr>
+          <w:p/>
+        </w:tc>
+        <w:tc>
+          <w:tcPr>
+            <w:tcW w:type="dxa" w:w="1728"/>
+          </w:tcPr>
+          <w:p/>
+        </w:tc>
+        <w:tc>
+          <w:tcPr>
+            <w:tcW w:type="dxa" w:w="1728"/>
+          </w:tcPr>
           <w:p>
             <w:r>
               <w:t>1</w:t>
@@ -544,6 +1632,38 @@
           <w:tcPr>
             <w:tcW w:type="dxa" w:w="1728"/>
           </w:tcPr>
+          <w:p/>
+        </w:tc>
+        <w:tc>
+          <w:tcPr>
+            <w:tcW w:type="dxa" w:w="1728"/>
+          </w:tcPr>
+          <w:p/>
+        </w:tc>
+      </w:tr>
+      <w:tr>
+        <w:tc>
+          <w:tcPr>
+            <w:tcW w:type="dxa" w:w="1728"/>
+          </w:tcPr>
+          <w:p/>
+        </w:tc>
+        <w:tc>
+          <w:tcPr>
+            <w:tcW w:type="dxa" w:w="1728"/>
+          </w:tcPr>
+          <w:p/>
+        </w:tc>
+        <w:tc>
+          <w:tcPr>
+            <w:tcW w:type="dxa" w:w="1728"/>
+          </w:tcPr>
+          <w:p/>
+        </w:tc>
+        <w:tc>
+          <w:tcPr>
+            <w:tcW w:type="dxa" w:w="1728"/>
+          </w:tcPr>
           <w:p>
             <w:r>
               <w:t>1.4370</w:t>
@@ -554,6 +1674,38 @@
           <w:tcPr>
             <w:tcW w:type="dxa" w:w="1728"/>
           </w:tcPr>
+          <w:p/>
+        </w:tc>
+      </w:tr>
+      <w:tr>
+        <w:tc>
+          <w:tcPr>
+            <w:tcW w:type="dxa" w:w="1728"/>
+          </w:tcPr>
+          <w:p/>
+        </w:tc>
+        <w:tc>
+          <w:tcPr>
+            <w:tcW w:type="dxa" w:w="1728"/>
+          </w:tcPr>
+          <w:p/>
+        </w:tc>
+        <w:tc>
+          <w:tcPr>
+            <w:tcW w:type="dxa" w:w="1728"/>
+          </w:tcPr>
+          <w:p/>
+        </w:tc>
+        <w:tc>
+          <w:tcPr>
+            <w:tcW w:type="dxa" w:w="1728"/>
+          </w:tcPr>
+          <w:p/>
+        </w:tc>
+        <w:tc>
+          <w:tcPr>
+            <w:tcW w:type="dxa" w:w="1728"/>
+          </w:tcPr>
           <w:p>
             <w:r>
               <w:t>1.4369</w:t>
@@ -576,6 +1728,38 @@
           <w:tcPr>
             <w:tcW w:type="dxa" w:w="1728"/>
           </w:tcPr>
+          <w:p/>
+        </w:tc>
+        <w:tc>
+          <w:tcPr>
+            <w:tcW w:type="dxa" w:w="1728"/>
+          </w:tcPr>
+          <w:p/>
+        </w:tc>
+        <w:tc>
+          <w:tcPr>
+            <w:tcW w:type="dxa" w:w="1728"/>
+          </w:tcPr>
+          <w:p/>
+        </w:tc>
+        <w:tc>
+          <w:tcPr>
+            <w:tcW w:type="dxa" w:w="1728"/>
+          </w:tcPr>
+          <w:p/>
+        </w:tc>
+      </w:tr>
+      <w:tr>
+        <w:tc>
+          <w:tcPr>
+            <w:tcW w:type="dxa" w:w="1728"/>
+          </w:tcPr>
+          <w:p/>
+        </w:tc>
+        <w:tc>
+          <w:tcPr>
+            <w:tcW w:type="dxa" w:w="1728"/>
+          </w:tcPr>
           <w:p>
             <w:r>
               <w:t>scale = 1.0</w:t>
@@ -586,6 +1770,38 @@
           <w:tcPr>
             <w:tcW w:type="dxa" w:w="1728"/>
           </w:tcPr>
+          <w:p/>
+        </w:tc>
+        <w:tc>
+          <w:tcPr>
+            <w:tcW w:type="dxa" w:w="1728"/>
+          </w:tcPr>
+          <w:p/>
+        </w:tc>
+        <w:tc>
+          <w:tcPr>
+            <w:tcW w:type="dxa" w:w="1728"/>
+          </w:tcPr>
+          <w:p/>
+        </w:tc>
+      </w:tr>
+      <w:tr>
+        <w:tc>
+          <w:tcPr>
+            <w:tcW w:type="dxa" w:w="1728"/>
+          </w:tcPr>
+          <w:p/>
+        </w:tc>
+        <w:tc>
+          <w:tcPr>
+            <w:tcW w:type="dxa" w:w="1728"/>
+          </w:tcPr>
+          <w:p/>
+        </w:tc>
+        <w:tc>
+          <w:tcPr>
+            <w:tcW w:type="dxa" w:w="1728"/>
+          </w:tcPr>
           <w:p>
             <w:r>
               <w:t>1</w:t>
@@ -596,6 +1812,38 @@
           <w:tcPr>
             <w:tcW w:type="dxa" w:w="1728"/>
           </w:tcPr>
+          <w:p/>
+        </w:tc>
+        <w:tc>
+          <w:tcPr>
+            <w:tcW w:type="dxa" w:w="1728"/>
+          </w:tcPr>
+          <w:p/>
+        </w:tc>
+      </w:tr>
+      <w:tr>
+        <w:tc>
+          <w:tcPr>
+            <w:tcW w:type="dxa" w:w="1728"/>
+          </w:tcPr>
+          <w:p/>
+        </w:tc>
+        <w:tc>
+          <w:tcPr>
+            <w:tcW w:type="dxa" w:w="1728"/>
+          </w:tcPr>
+          <w:p/>
+        </w:tc>
+        <w:tc>
+          <w:tcPr>
+            <w:tcW w:type="dxa" w:w="1728"/>
+          </w:tcPr>
+          <w:p/>
+        </w:tc>
+        <w:tc>
+          <w:tcPr>
+            <w:tcW w:type="dxa" w:w="1728"/>
+          </w:tcPr>
           <w:p>
             <w:r>
               <w:t>1.4370</w:t>
@@ -606,6 +1854,38 @@
           <w:tcPr>
             <w:tcW w:type="dxa" w:w="1728"/>
           </w:tcPr>
+          <w:p/>
+        </w:tc>
+      </w:tr>
+      <w:tr>
+        <w:tc>
+          <w:tcPr>
+            <w:tcW w:type="dxa" w:w="1728"/>
+          </w:tcPr>
+          <w:p/>
+        </w:tc>
+        <w:tc>
+          <w:tcPr>
+            <w:tcW w:type="dxa" w:w="1728"/>
+          </w:tcPr>
+          <w:p/>
+        </w:tc>
+        <w:tc>
+          <w:tcPr>
+            <w:tcW w:type="dxa" w:w="1728"/>
+          </w:tcPr>
+          <w:p/>
+        </w:tc>
+        <w:tc>
+          <w:tcPr>
+            <w:tcW w:type="dxa" w:w="1728"/>
+          </w:tcPr>
+          <w:p/>
+        </w:tc>
+        <w:tc>
+          <w:tcPr>
+            <w:tcW w:type="dxa" w:w="1728"/>
+          </w:tcPr>
           <w:p>
             <w:r>
               <w:t>1.4369</w:t>
@@ -628,6 +1908,38 @@
           <w:tcPr>
             <w:tcW w:type="dxa" w:w="1728"/>
           </w:tcPr>
+          <w:p/>
+        </w:tc>
+        <w:tc>
+          <w:tcPr>
+            <w:tcW w:type="dxa" w:w="1728"/>
+          </w:tcPr>
+          <w:p/>
+        </w:tc>
+        <w:tc>
+          <w:tcPr>
+            <w:tcW w:type="dxa" w:w="1728"/>
+          </w:tcPr>
+          <w:p/>
+        </w:tc>
+        <w:tc>
+          <w:tcPr>
+            <w:tcW w:type="dxa" w:w="1728"/>
+          </w:tcPr>
+          <w:p/>
+        </w:tc>
+      </w:tr>
+      <w:tr>
+        <w:tc>
+          <w:tcPr>
+            <w:tcW w:type="dxa" w:w="1728"/>
+          </w:tcPr>
+          <w:p/>
+        </w:tc>
+        <w:tc>
+          <w:tcPr>
+            <w:tcW w:type="dxa" w:w="1728"/>
+          </w:tcPr>
           <w:p>
             <w:r>
               <w:t>scale = 0.2</w:t>
@@ -638,6 +1950,38 @@
           <w:tcPr>
             <w:tcW w:type="dxa" w:w="1728"/>
           </w:tcPr>
+          <w:p/>
+        </w:tc>
+        <w:tc>
+          <w:tcPr>
+            <w:tcW w:type="dxa" w:w="1728"/>
+          </w:tcPr>
+          <w:p/>
+        </w:tc>
+        <w:tc>
+          <w:tcPr>
+            <w:tcW w:type="dxa" w:w="1728"/>
+          </w:tcPr>
+          <w:p/>
+        </w:tc>
+      </w:tr>
+      <w:tr>
+        <w:tc>
+          <w:tcPr>
+            <w:tcW w:type="dxa" w:w="1728"/>
+          </w:tcPr>
+          <w:p/>
+        </w:tc>
+        <w:tc>
+          <w:tcPr>
+            <w:tcW w:type="dxa" w:w="1728"/>
+          </w:tcPr>
+          <w:p/>
+        </w:tc>
+        <w:tc>
+          <w:tcPr>
+            <w:tcW w:type="dxa" w:w="1728"/>
+          </w:tcPr>
           <w:p>
             <w:r>
               <w:t>4</w:t>
@@ -648,6 +1992,38 @@
           <w:tcPr>
             <w:tcW w:type="dxa" w:w="1728"/>
           </w:tcPr>
+          <w:p/>
+        </w:tc>
+        <w:tc>
+          <w:tcPr>
+            <w:tcW w:type="dxa" w:w="1728"/>
+          </w:tcPr>
+          <w:p/>
+        </w:tc>
+      </w:tr>
+      <w:tr>
+        <w:tc>
+          <w:tcPr>
+            <w:tcW w:type="dxa" w:w="1728"/>
+          </w:tcPr>
+          <w:p/>
+        </w:tc>
+        <w:tc>
+          <w:tcPr>
+            <w:tcW w:type="dxa" w:w="1728"/>
+          </w:tcPr>
+          <w:p/>
+        </w:tc>
+        <w:tc>
+          <w:tcPr>
+            <w:tcW w:type="dxa" w:w="1728"/>
+          </w:tcPr>
+          <w:p/>
+        </w:tc>
+        <w:tc>
+          <w:tcPr>
+            <w:tcW w:type="dxa" w:w="1728"/>
+          </w:tcPr>
           <w:p>
             <w:r>
               <w:t>1.4515</w:t>
@@ -658,6 +2034,38 @@
           <w:tcPr>
             <w:tcW w:type="dxa" w:w="1728"/>
           </w:tcPr>
+          <w:p/>
+        </w:tc>
+      </w:tr>
+      <w:tr>
+        <w:tc>
+          <w:tcPr>
+            <w:tcW w:type="dxa" w:w="1728"/>
+          </w:tcPr>
+          <w:p/>
+        </w:tc>
+        <w:tc>
+          <w:tcPr>
+            <w:tcW w:type="dxa" w:w="1728"/>
+          </w:tcPr>
+          <w:p/>
+        </w:tc>
+        <w:tc>
+          <w:tcPr>
+            <w:tcW w:type="dxa" w:w="1728"/>
+          </w:tcPr>
+          <w:p/>
+        </w:tc>
+        <w:tc>
+          <w:tcPr>
+            <w:tcW w:type="dxa" w:w="1728"/>
+          </w:tcPr>
+          <w:p/>
+        </w:tc>
+        <w:tc>
+          <w:tcPr>
+            <w:tcW w:type="dxa" w:w="1728"/>
+          </w:tcPr>
           <w:p>
             <w:r>
               <w:t>1.4207</w:t>
@@ -668,7 +2076,7 @@
     </w:tbl>
     <w:p>
       <w:r>
-        <w:t>The failure-sweep row at rep 1 appears at all six failure rates because every rate is evaluated on the same generated instance; it is one instance, not six. The slack alpha=1.5 rep-1, failure rep-1, and bandwidth 1.0 rep-1 rows are likewise the same default instance. The bandwidth-blind baseline also appears above the MILP at degraded bandwidths, but it ignores transfer costs entirely and is not a like-for-like comparator, so it is excluded here.</w:t>
+        <w:t>Two clarifications are necessary for interpreting this list. The failure-sweep entry at rep 1 appears under all six failure rates because each rate is evaluated on the same generated instance, so this corresponds to a single instance rather than six distinct ones. That same default instance also underlies slack alpha = 1.5 rep 1, failure rep 1, and bandwidth scale = 1.0 rep 1. In addition, although the bandwidth-blind baseline can exceed the MILP under degraded bandwidth, it is not a like-for-like comparator because it ignores transfer costs, so it is not included here.</w:t>
       </w:r>
     </w:p>
     <w:p>
@@ -709,7 +2117,7 @@
     </w:p>
     <w:p>
       <w:r>
-        <w:t>Figure 4 as regenerated after the fix (below).</w:t>
+        <w:t>Figure 4 (deadline slack), regenerated after the fix.</w:t>
       </w:r>
     </w:p>
     <w:p>
@@ -750,7 +2158,7 @@
     </w:p>
     <w:p>
       <w:r>
-        <w:t>Figure 5 as regenerated after the fix.</w:t>
+        <w:t>Figure 5 (federation size), regenerated after the fix.</w:t>
       </w:r>
     </w:p>
     <w:p>
@@ -758,12 +2166,12 @@
         <w:pStyle w:val="Heading1"/>
       </w:pPr>
       <w:r>
-        <w:t>2. Rerunning the MILP on the same instances</w:t>
+        <w:t>2. Diagnostic MILP reruns for the flagged points</w:t>
       </w:r>
     </w:p>
     <w:p>
       <w:r>
-        <w:t>Each flagged instance was regenerated with the exact arguments and seed the sweep used (seed = 1000 x rep; 50 tasks / 5 nodes / alpha=1.5 unless the sweep axis changes it), then solved twice: at the original 60 s limit, and at 300 s. Solver status, wall time, and MIP gap:</w:t>
+        <w:t>To reproduce each flagged comparison, the corresponding instance was regenerated deterministically using the identical sweep arguments and seed (seed = 1000 x rep; defaults are 50 tasks, 5 nodes, alpha = 1.5 unless overridden by the sweep axis). The MILP was then solved twice per instance: first using the original 60 s limit, and again with a 300 s time limit. The table below reports the solver status, wall time, and resulting scores.</w:t>
       </w:r>
     </w:p>
     <w:tbl>
@@ -868,6 +2276,50 @@
           <w:tcPr>
             <w:tcW w:type="dxa" w:w="1234"/>
           </w:tcPr>
+          <w:p/>
+        </w:tc>
+        <w:tc>
+          <w:tcPr>
+            <w:tcW w:type="dxa" w:w="1234"/>
+          </w:tcPr>
+          <w:p/>
+        </w:tc>
+        <w:tc>
+          <w:tcPr>
+            <w:tcW w:type="dxa" w:w="1234"/>
+          </w:tcPr>
+          <w:p/>
+        </w:tc>
+        <w:tc>
+          <w:tcPr>
+            <w:tcW w:type="dxa" w:w="1234"/>
+          </w:tcPr>
+          <w:p/>
+        </w:tc>
+        <w:tc>
+          <w:tcPr>
+            <w:tcW w:type="dxa" w:w="1234"/>
+          </w:tcPr>
+          <w:p/>
+        </w:tc>
+        <w:tc>
+          <w:tcPr>
+            <w:tcW w:type="dxa" w:w="1234"/>
+          </w:tcPr>
+          <w:p/>
+        </w:tc>
+      </w:tr>
+      <w:tr>
+        <w:tc>
+          <w:tcPr>
+            <w:tcW w:type="dxa" w:w="1234"/>
+          </w:tcPr>
+          <w:p/>
+        </w:tc>
+        <w:tc>
+          <w:tcPr>
+            <w:tcW w:type="dxa" w:w="1234"/>
+          </w:tcPr>
           <w:p>
             <w:r>
               <w:t>time limit (1)</w:t>
@@ -878,6 +2330,50 @@
           <w:tcPr>
             <w:tcW w:type="dxa" w:w="1234"/>
           </w:tcPr>
+          <w:p/>
+        </w:tc>
+        <w:tc>
+          <w:tcPr>
+            <w:tcW w:type="dxa" w:w="1234"/>
+          </w:tcPr>
+          <w:p/>
+        </w:tc>
+        <w:tc>
+          <w:tcPr>
+            <w:tcW w:type="dxa" w:w="1234"/>
+          </w:tcPr>
+          <w:p/>
+        </w:tc>
+        <w:tc>
+          <w:tcPr>
+            <w:tcW w:type="dxa" w:w="1234"/>
+          </w:tcPr>
+          <w:p/>
+        </w:tc>
+        <w:tc>
+          <w:tcPr>
+            <w:tcW w:type="dxa" w:w="1234"/>
+          </w:tcPr>
+          <w:p/>
+        </w:tc>
+      </w:tr>
+      <w:tr>
+        <w:tc>
+          <w:tcPr>
+            <w:tcW w:type="dxa" w:w="1234"/>
+          </w:tcPr>
+          <w:p/>
+        </w:tc>
+        <w:tc>
+          <w:tcPr>
+            <w:tcW w:type="dxa" w:w="1234"/>
+          </w:tcPr>
+          <w:p/>
+        </w:tc>
+        <w:tc>
+          <w:tcPr>
+            <w:tcW w:type="dxa" w:w="1234"/>
+          </w:tcPr>
           <w:p>
             <w:r>
               <w:t>60.6 s</w:t>
@@ -888,6 +2384,50 @@
           <w:tcPr>
             <w:tcW w:type="dxa" w:w="1234"/>
           </w:tcPr>
+          <w:p/>
+        </w:tc>
+        <w:tc>
+          <w:tcPr>
+            <w:tcW w:type="dxa" w:w="1234"/>
+          </w:tcPr>
+          <w:p/>
+        </w:tc>
+        <w:tc>
+          <w:tcPr>
+            <w:tcW w:type="dxa" w:w="1234"/>
+          </w:tcPr>
+          <w:p/>
+        </w:tc>
+        <w:tc>
+          <w:tcPr>
+            <w:tcW w:type="dxa" w:w="1234"/>
+          </w:tcPr>
+          <w:p/>
+        </w:tc>
+      </w:tr>
+      <w:tr>
+        <w:tc>
+          <w:tcPr>
+            <w:tcW w:type="dxa" w:w="1234"/>
+          </w:tcPr>
+          <w:p/>
+        </w:tc>
+        <w:tc>
+          <w:tcPr>
+            <w:tcW w:type="dxa" w:w="1234"/>
+          </w:tcPr>
+          <w:p/>
+        </w:tc>
+        <w:tc>
+          <w:tcPr>
+            <w:tcW w:type="dxa" w:w="1234"/>
+          </w:tcPr>
+          <w:p/>
+        </w:tc>
+        <w:tc>
+          <w:tcPr>
+            <w:tcW w:type="dxa" w:w="1234"/>
+          </w:tcPr>
           <w:p>
             <w:r>
               <w:t>1.4383</w:t>
@@ -898,6 +2438,50 @@
           <w:tcPr>
             <w:tcW w:type="dxa" w:w="1234"/>
           </w:tcPr>
+          <w:p/>
+        </w:tc>
+        <w:tc>
+          <w:tcPr>
+            <w:tcW w:type="dxa" w:w="1234"/>
+          </w:tcPr>
+          <w:p/>
+        </w:tc>
+        <w:tc>
+          <w:tcPr>
+            <w:tcW w:type="dxa" w:w="1234"/>
+          </w:tcPr>
+          <w:p/>
+        </w:tc>
+      </w:tr>
+      <w:tr>
+        <w:tc>
+          <w:tcPr>
+            <w:tcW w:type="dxa" w:w="1234"/>
+          </w:tcPr>
+          <w:p/>
+        </w:tc>
+        <w:tc>
+          <w:tcPr>
+            <w:tcW w:type="dxa" w:w="1234"/>
+          </w:tcPr>
+          <w:p/>
+        </w:tc>
+        <w:tc>
+          <w:tcPr>
+            <w:tcW w:type="dxa" w:w="1234"/>
+          </w:tcPr>
+          <w:p/>
+        </w:tc>
+        <w:tc>
+          <w:tcPr>
+            <w:tcW w:type="dxa" w:w="1234"/>
+          </w:tcPr>
+          <w:p/>
+        </w:tc>
+        <w:tc>
+          <w:tcPr>
+            <w:tcW w:type="dxa" w:w="1234"/>
+          </w:tcPr>
           <w:p>
             <w:r>
               <w:t>optimal (0)</w:t>
@@ -908,6 +2492,50 @@
           <w:tcPr>
             <w:tcW w:type="dxa" w:w="1234"/>
           </w:tcPr>
+          <w:p/>
+        </w:tc>
+        <w:tc>
+          <w:tcPr>
+            <w:tcW w:type="dxa" w:w="1234"/>
+          </w:tcPr>
+          <w:p/>
+        </w:tc>
+      </w:tr>
+      <w:tr>
+        <w:tc>
+          <w:tcPr>
+            <w:tcW w:type="dxa" w:w="1234"/>
+          </w:tcPr>
+          <w:p/>
+        </w:tc>
+        <w:tc>
+          <w:tcPr>
+            <w:tcW w:type="dxa" w:w="1234"/>
+          </w:tcPr>
+          <w:p/>
+        </w:tc>
+        <w:tc>
+          <w:tcPr>
+            <w:tcW w:type="dxa" w:w="1234"/>
+          </w:tcPr>
+          <w:p/>
+        </w:tc>
+        <w:tc>
+          <w:tcPr>
+            <w:tcW w:type="dxa" w:w="1234"/>
+          </w:tcPr>
+          <w:p/>
+        </w:tc>
+        <w:tc>
+          <w:tcPr>
+            <w:tcW w:type="dxa" w:w="1234"/>
+          </w:tcPr>
+          <w:p/>
+        </w:tc>
+        <w:tc>
+          <w:tcPr>
+            <w:tcW w:type="dxa" w:w="1234"/>
+          </w:tcPr>
           <w:p>
             <w:r>
               <w:t>1.4422</w:t>
@@ -918,6 +2546,50 @@
           <w:tcPr>
             <w:tcW w:type="dxa" w:w="1234"/>
           </w:tcPr>
+          <w:p/>
+        </w:tc>
+      </w:tr>
+      <w:tr>
+        <w:tc>
+          <w:tcPr>
+            <w:tcW w:type="dxa" w:w="1234"/>
+          </w:tcPr>
+          <w:p/>
+        </w:tc>
+        <w:tc>
+          <w:tcPr>
+            <w:tcW w:type="dxa" w:w="1234"/>
+          </w:tcPr>
+          <w:p/>
+        </w:tc>
+        <w:tc>
+          <w:tcPr>
+            <w:tcW w:type="dxa" w:w="1234"/>
+          </w:tcPr>
+          <w:p/>
+        </w:tc>
+        <w:tc>
+          <w:tcPr>
+            <w:tcW w:type="dxa" w:w="1234"/>
+          </w:tcPr>
+          <w:p/>
+        </w:tc>
+        <w:tc>
+          <w:tcPr>
+            <w:tcW w:type="dxa" w:w="1234"/>
+          </w:tcPr>
+          <w:p/>
+        </w:tc>
+        <w:tc>
+          <w:tcPr>
+            <w:tcW w:type="dxa" w:w="1234"/>
+          </w:tcPr>
+          <w:p/>
+        </w:tc>
+        <w:tc>
+          <w:tcPr>
+            <w:tcW w:type="dxa" w:w="1234"/>
+          </w:tcPr>
           <w:p>
             <w:r>
               <w:t>1.4422</w:t>
@@ -940,6 +2612,50 @@
           <w:tcPr>
             <w:tcW w:type="dxa" w:w="1234"/>
           </w:tcPr>
+          <w:p/>
+        </w:tc>
+        <w:tc>
+          <w:tcPr>
+            <w:tcW w:type="dxa" w:w="1234"/>
+          </w:tcPr>
+          <w:p/>
+        </w:tc>
+        <w:tc>
+          <w:tcPr>
+            <w:tcW w:type="dxa" w:w="1234"/>
+          </w:tcPr>
+          <w:p/>
+        </w:tc>
+        <w:tc>
+          <w:tcPr>
+            <w:tcW w:type="dxa" w:w="1234"/>
+          </w:tcPr>
+          <w:p/>
+        </w:tc>
+        <w:tc>
+          <w:tcPr>
+            <w:tcW w:type="dxa" w:w="1234"/>
+          </w:tcPr>
+          <w:p/>
+        </w:tc>
+        <w:tc>
+          <w:tcPr>
+            <w:tcW w:type="dxa" w:w="1234"/>
+          </w:tcPr>
+          <w:p/>
+        </w:tc>
+      </w:tr>
+      <w:tr>
+        <w:tc>
+          <w:tcPr>
+            <w:tcW w:type="dxa" w:w="1234"/>
+          </w:tcPr>
+          <w:p/>
+        </w:tc>
+        <w:tc>
+          <w:tcPr>
+            <w:tcW w:type="dxa" w:w="1234"/>
+          </w:tcPr>
           <w:p>
             <w:r>
               <w:t>time limit (1)</w:t>
@@ -950,6 +2666,50 @@
           <w:tcPr>
             <w:tcW w:type="dxa" w:w="1234"/>
           </w:tcPr>
+          <w:p/>
+        </w:tc>
+        <w:tc>
+          <w:tcPr>
+            <w:tcW w:type="dxa" w:w="1234"/>
+          </w:tcPr>
+          <w:p/>
+        </w:tc>
+        <w:tc>
+          <w:tcPr>
+            <w:tcW w:type="dxa" w:w="1234"/>
+          </w:tcPr>
+          <w:p/>
+        </w:tc>
+        <w:tc>
+          <w:tcPr>
+            <w:tcW w:type="dxa" w:w="1234"/>
+          </w:tcPr>
+          <w:p/>
+        </w:tc>
+        <w:tc>
+          <w:tcPr>
+            <w:tcW w:type="dxa" w:w="1234"/>
+          </w:tcPr>
+          <w:p/>
+        </w:tc>
+      </w:tr>
+      <w:tr>
+        <w:tc>
+          <w:tcPr>
+            <w:tcW w:type="dxa" w:w="1234"/>
+          </w:tcPr>
+          <w:p/>
+        </w:tc>
+        <w:tc>
+          <w:tcPr>
+            <w:tcW w:type="dxa" w:w="1234"/>
+          </w:tcPr>
+          <w:p/>
+        </w:tc>
+        <w:tc>
+          <w:tcPr>
+            <w:tcW w:type="dxa" w:w="1234"/>
+          </w:tcPr>
           <w:p>
             <w:r>
               <w:t>60.6 s</w:t>
@@ -960,6 +2720,50 @@
           <w:tcPr>
             <w:tcW w:type="dxa" w:w="1234"/>
           </w:tcPr>
+          <w:p/>
+        </w:tc>
+        <w:tc>
+          <w:tcPr>
+            <w:tcW w:type="dxa" w:w="1234"/>
+          </w:tcPr>
+          <w:p/>
+        </w:tc>
+        <w:tc>
+          <w:tcPr>
+            <w:tcW w:type="dxa" w:w="1234"/>
+          </w:tcPr>
+          <w:p/>
+        </w:tc>
+        <w:tc>
+          <w:tcPr>
+            <w:tcW w:type="dxa" w:w="1234"/>
+          </w:tcPr>
+          <w:p/>
+        </w:tc>
+      </w:tr>
+      <w:tr>
+        <w:tc>
+          <w:tcPr>
+            <w:tcW w:type="dxa" w:w="1234"/>
+          </w:tcPr>
+          <w:p/>
+        </w:tc>
+        <w:tc>
+          <w:tcPr>
+            <w:tcW w:type="dxa" w:w="1234"/>
+          </w:tcPr>
+          <w:p/>
+        </w:tc>
+        <w:tc>
+          <w:tcPr>
+            <w:tcW w:type="dxa" w:w="1234"/>
+          </w:tcPr>
+          <w:p/>
+        </w:tc>
+        <w:tc>
+          <w:tcPr>
+            <w:tcW w:type="dxa" w:w="1234"/>
+          </w:tcPr>
           <w:p>
             <w:r>
               <w:t>1.4040</w:t>
@@ -970,6 +2774,50 @@
           <w:tcPr>
             <w:tcW w:type="dxa" w:w="1234"/>
           </w:tcPr>
+          <w:p/>
+        </w:tc>
+        <w:tc>
+          <w:tcPr>
+            <w:tcW w:type="dxa" w:w="1234"/>
+          </w:tcPr>
+          <w:p/>
+        </w:tc>
+        <w:tc>
+          <w:tcPr>
+            <w:tcW w:type="dxa" w:w="1234"/>
+          </w:tcPr>
+          <w:p/>
+        </w:tc>
+      </w:tr>
+      <w:tr>
+        <w:tc>
+          <w:tcPr>
+            <w:tcW w:type="dxa" w:w="1234"/>
+          </w:tcPr>
+          <w:p/>
+        </w:tc>
+        <w:tc>
+          <w:tcPr>
+            <w:tcW w:type="dxa" w:w="1234"/>
+          </w:tcPr>
+          <w:p/>
+        </w:tc>
+        <w:tc>
+          <w:tcPr>
+            <w:tcW w:type="dxa" w:w="1234"/>
+          </w:tcPr>
+          <w:p/>
+        </w:tc>
+        <w:tc>
+          <w:tcPr>
+            <w:tcW w:type="dxa" w:w="1234"/>
+          </w:tcPr>
+          <w:p/>
+        </w:tc>
+        <w:tc>
+          <w:tcPr>
+            <w:tcW w:type="dxa" w:w="1234"/>
+          </w:tcPr>
           <w:p>
             <w:r>
               <w:t>optimal (0)</w:t>
@@ -980,6 +2828,50 @@
           <w:tcPr>
             <w:tcW w:type="dxa" w:w="1234"/>
           </w:tcPr>
+          <w:p/>
+        </w:tc>
+        <w:tc>
+          <w:tcPr>
+            <w:tcW w:type="dxa" w:w="1234"/>
+          </w:tcPr>
+          <w:p/>
+        </w:tc>
+      </w:tr>
+      <w:tr>
+        <w:tc>
+          <w:tcPr>
+            <w:tcW w:type="dxa" w:w="1234"/>
+          </w:tcPr>
+          <w:p/>
+        </w:tc>
+        <w:tc>
+          <w:tcPr>
+            <w:tcW w:type="dxa" w:w="1234"/>
+          </w:tcPr>
+          <w:p/>
+        </w:tc>
+        <w:tc>
+          <w:tcPr>
+            <w:tcW w:type="dxa" w:w="1234"/>
+          </w:tcPr>
+          <w:p/>
+        </w:tc>
+        <w:tc>
+          <w:tcPr>
+            <w:tcW w:type="dxa" w:w="1234"/>
+          </w:tcPr>
+          <w:p/>
+        </w:tc>
+        <w:tc>
+          <w:tcPr>
+            <w:tcW w:type="dxa" w:w="1234"/>
+          </w:tcPr>
+          <w:p/>
+        </w:tc>
+        <w:tc>
+          <w:tcPr>
+            <w:tcW w:type="dxa" w:w="1234"/>
+          </w:tcPr>
           <w:p>
             <w:r>
               <w:t>1.4226</w:t>
@@ -990,6 +2882,50 @@
           <w:tcPr>
             <w:tcW w:type="dxa" w:w="1234"/>
           </w:tcPr>
+          <w:p/>
+        </w:tc>
+      </w:tr>
+      <w:tr>
+        <w:tc>
+          <w:tcPr>
+            <w:tcW w:type="dxa" w:w="1234"/>
+          </w:tcPr>
+          <w:p/>
+        </w:tc>
+        <w:tc>
+          <w:tcPr>
+            <w:tcW w:type="dxa" w:w="1234"/>
+          </w:tcPr>
+          <w:p/>
+        </w:tc>
+        <w:tc>
+          <w:tcPr>
+            <w:tcW w:type="dxa" w:w="1234"/>
+          </w:tcPr>
+          <w:p/>
+        </w:tc>
+        <w:tc>
+          <w:tcPr>
+            <w:tcW w:type="dxa" w:w="1234"/>
+          </w:tcPr>
+          <w:p/>
+        </w:tc>
+        <w:tc>
+          <w:tcPr>
+            <w:tcW w:type="dxa" w:w="1234"/>
+          </w:tcPr>
+          <w:p/>
+        </w:tc>
+        <w:tc>
+          <w:tcPr>
+            <w:tcW w:type="dxa" w:w="1234"/>
+          </w:tcPr>
+          <w:p/>
+        </w:tc>
+        <w:tc>
+          <w:tcPr>
+            <w:tcW w:type="dxa" w:w="1234"/>
+          </w:tcPr>
           <w:p>
             <w:r>
               <w:t>1.4226</w:t>
@@ -1012,6 +2948,50 @@
           <w:tcPr>
             <w:tcW w:type="dxa" w:w="1234"/>
           </w:tcPr>
+          <w:p/>
+        </w:tc>
+        <w:tc>
+          <w:tcPr>
+            <w:tcW w:type="dxa" w:w="1234"/>
+          </w:tcPr>
+          <w:p/>
+        </w:tc>
+        <w:tc>
+          <w:tcPr>
+            <w:tcW w:type="dxa" w:w="1234"/>
+          </w:tcPr>
+          <w:p/>
+        </w:tc>
+        <w:tc>
+          <w:tcPr>
+            <w:tcW w:type="dxa" w:w="1234"/>
+          </w:tcPr>
+          <w:p/>
+        </w:tc>
+        <w:tc>
+          <w:tcPr>
+            <w:tcW w:type="dxa" w:w="1234"/>
+          </w:tcPr>
+          <w:p/>
+        </w:tc>
+        <w:tc>
+          <w:tcPr>
+            <w:tcW w:type="dxa" w:w="1234"/>
+          </w:tcPr>
+          <w:p/>
+        </w:tc>
+      </w:tr>
+      <w:tr>
+        <w:tc>
+          <w:tcPr>
+            <w:tcW w:type="dxa" w:w="1234"/>
+          </w:tcPr>
+          <w:p/>
+        </w:tc>
+        <w:tc>
+          <w:tcPr>
+            <w:tcW w:type="dxa" w:w="1234"/>
+          </w:tcPr>
           <w:p>
             <w:r>
               <w:t>time limit (1)</w:t>
@@ -1022,6 +3002,50 @@
           <w:tcPr>
             <w:tcW w:type="dxa" w:w="1234"/>
           </w:tcPr>
+          <w:p/>
+        </w:tc>
+        <w:tc>
+          <w:tcPr>
+            <w:tcW w:type="dxa" w:w="1234"/>
+          </w:tcPr>
+          <w:p/>
+        </w:tc>
+        <w:tc>
+          <w:tcPr>
+            <w:tcW w:type="dxa" w:w="1234"/>
+          </w:tcPr>
+          <w:p/>
+        </w:tc>
+        <w:tc>
+          <w:tcPr>
+            <w:tcW w:type="dxa" w:w="1234"/>
+          </w:tcPr>
+          <w:p/>
+        </w:tc>
+        <w:tc>
+          <w:tcPr>
+            <w:tcW w:type="dxa" w:w="1234"/>
+          </w:tcPr>
+          <w:p/>
+        </w:tc>
+      </w:tr>
+      <w:tr>
+        <w:tc>
+          <w:tcPr>
+            <w:tcW w:type="dxa" w:w="1234"/>
+          </w:tcPr>
+          <w:p/>
+        </w:tc>
+        <w:tc>
+          <w:tcPr>
+            <w:tcW w:type="dxa" w:w="1234"/>
+          </w:tcPr>
+          <w:p/>
+        </w:tc>
+        <w:tc>
+          <w:tcPr>
+            <w:tcW w:type="dxa" w:w="1234"/>
+          </w:tcPr>
           <w:p>
             <w:r>
               <w:t>60.6 s</w:t>
@@ -1032,6 +3056,50 @@
           <w:tcPr>
             <w:tcW w:type="dxa" w:w="1234"/>
           </w:tcPr>
+          <w:p/>
+        </w:tc>
+        <w:tc>
+          <w:tcPr>
+            <w:tcW w:type="dxa" w:w="1234"/>
+          </w:tcPr>
+          <w:p/>
+        </w:tc>
+        <w:tc>
+          <w:tcPr>
+            <w:tcW w:type="dxa" w:w="1234"/>
+          </w:tcPr>
+          <w:p/>
+        </w:tc>
+        <w:tc>
+          <w:tcPr>
+            <w:tcW w:type="dxa" w:w="1234"/>
+          </w:tcPr>
+          <w:p/>
+        </w:tc>
+      </w:tr>
+      <w:tr>
+        <w:tc>
+          <w:tcPr>
+            <w:tcW w:type="dxa" w:w="1234"/>
+          </w:tcPr>
+          <w:p/>
+        </w:tc>
+        <w:tc>
+          <w:tcPr>
+            <w:tcW w:type="dxa" w:w="1234"/>
+          </w:tcPr>
+          <w:p/>
+        </w:tc>
+        <w:tc>
+          <w:tcPr>
+            <w:tcW w:type="dxa" w:w="1234"/>
+          </w:tcPr>
+          <w:p/>
+        </w:tc>
+        <w:tc>
+          <w:tcPr>
+            <w:tcW w:type="dxa" w:w="1234"/>
+          </w:tcPr>
           <w:p>
             <w:r>
               <w:t>1.4481</w:t>
@@ -1042,6 +3110,50 @@
           <w:tcPr>
             <w:tcW w:type="dxa" w:w="1234"/>
           </w:tcPr>
+          <w:p/>
+        </w:tc>
+        <w:tc>
+          <w:tcPr>
+            <w:tcW w:type="dxa" w:w="1234"/>
+          </w:tcPr>
+          <w:p/>
+        </w:tc>
+        <w:tc>
+          <w:tcPr>
+            <w:tcW w:type="dxa" w:w="1234"/>
+          </w:tcPr>
+          <w:p/>
+        </w:tc>
+      </w:tr>
+      <w:tr>
+        <w:tc>
+          <w:tcPr>
+            <w:tcW w:type="dxa" w:w="1234"/>
+          </w:tcPr>
+          <w:p/>
+        </w:tc>
+        <w:tc>
+          <w:tcPr>
+            <w:tcW w:type="dxa" w:w="1234"/>
+          </w:tcPr>
+          <w:p/>
+        </w:tc>
+        <w:tc>
+          <w:tcPr>
+            <w:tcW w:type="dxa" w:w="1234"/>
+          </w:tcPr>
+          <w:p/>
+        </w:tc>
+        <w:tc>
+          <w:tcPr>
+            <w:tcW w:type="dxa" w:w="1234"/>
+          </w:tcPr>
+          <w:p/>
+        </w:tc>
+        <w:tc>
+          <w:tcPr>
+            <w:tcW w:type="dxa" w:w="1234"/>
+          </w:tcPr>
           <w:p>
             <w:r>
               <w:t>optimal (0)</w:t>
@@ -1052,6 +3164,50 @@
           <w:tcPr>
             <w:tcW w:type="dxa" w:w="1234"/>
           </w:tcPr>
+          <w:p/>
+        </w:tc>
+        <w:tc>
+          <w:tcPr>
+            <w:tcW w:type="dxa" w:w="1234"/>
+          </w:tcPr>
+          <w:p/>
+        </w:tc>
+      </w:tr>
+      <w:tr>
+        <w:tc>
+          <w:tcPr>
+            <w:tcW w:type="dxa" w:w="1234"/>
+          </w:tcPr>
+          <w:p/>
+        </w:tc>
+        <w:tc>
+          <w:tcPr>
+            <w:tcW w:type="dxa" w:w="1234"/>
+          </w:tcPr>
+          <w:p/>
+        </w:tc>
+        <w:tc>
+          <w:tcPr>
+            <w:tcW w:type="dxa" w:w="1234"/>
+          </w:tcPr>
+          <w:p/>
+        </w:tc>
+        <w:tc>
+          <w:tcPr>
+            <w:tcW w:type="dxa" w:w="1234"/>
+          </w:tcPr>
+          <w:p/>
+        </w:tc>
+        <w:tc>
+          <w:tcPr>
+            <w:tcW w:type="dxa" w:w="1234"/>
+          </w:tcPr>
+          <w:p/>
+        </w:tc>
+        <w:tc>
+          <w:tcPr>
+            <w:tcW w:type="dxa" w:w="1234"/>
+          </w:tcPr>
           <w:p>
             <w:r>
               <w:t>1.4515</w:t>
@@ -1062,6 +3218,50 @@
           <w:tcPr>
             <w:tcW w:type="dxa" w:w="1234"/>
           </w:tcPr>
+          <w:p/>
+        </w:tc>
+      </w:tr>
+      <w:tr>
+        <w:tc>
+          <w:tcPr>
+            <w:tcW w:type="dxa" w:w="1234"/>
+          </w:tcPr>
+          <w:p/>
+        </w:tc>
+        <w:tc>
+          <w:tcPr>
+            <w:tcW w:type="dxa" w:w="1234"/>
+          </w:tcPr>
+          <w:p/>
+        </w:tc>
+        <w:tc>
+          <w:tcPr>
+            <w:tcW w:type="dxa" w:w="1234"/>
+          </w:tcPr>
+          <w:p/>
+        </w:tc>
+        <w:tc>
+          <w:tcPr>
+            <w:tcW w:type="dxa" w:w="1234"/>
+          </w:tcPr>
+          <w:p/>
+        </w:tc>
+        <w:tc>
+          <w:tcPr>
+            <w:tcW w:type="dxa" w:w="1234"/>
+          </w:tcPr>
+          <w:p/>
+        </w:tc>
+        <w:tc>
+          <w:tcPr>
+            <w:tcW w:type="dxa" w:w="1234"/>
+          </w:tcPr>
+          <w:p/>
+        </w:tc>
+        <w:tc>
+          <w:tcPr>
+            <w:tcW w:type="dxa" w:w="1234"/>
+          </w:tcPr>
           <w:p>
             <w:r>
               <w:t>1.4515</w:t>
@@ -1084,6 +3284,50 @@
           <w:tcPr>
             <w:tcW w:type="dxa" w:w="1234"/>
           </w:tcPr>
+          <w:p/>
+        </w:tc>
+        <w:tc>
+          <w:tcPr>
+            <w:tcW w:type="dxa" w:w="1234"/>
+          </w:tcPr>
+          <w:p/>
+        </w:tc>
+        <w:tc>
+          <w:tcPr>
+            <w:tcW w:type="dxa" w:w="1234"/>
+          </w:tcPr>
+          <w:p/>
+        </w:tc>
+        <w:tc>
+          <w:tcPr>
+            <w:tcW w:type="dxa" w:w="1234"/>
+          </w:tcPr>
+          <w:p/>
+        </w:tc>
+        <w:tc>
+          <w:tcPr>
+            <w:tcW w:type="dxa" w:w="1234"/>
+          </w:tcPr>
+          <w:p/>
+        </w:tc>
+        <w:tc>
+          <w:tcPr>
+            <w:tcW w:type="dxa" w:w="1234"/>
+          </w:tcPr>
+          <w:p/>
+        </w:tc>
+      </w:tr>
+      <w:tr>
+        <w:tc>
+          <w:tcPr>
+            <w:tcW w:type="dxa" w:w="1234"/>
+          </w:tcPr>
+          <w:p/>
+        </w:tc>
+        <w:tc>
+          <w:tcPr>
+            <w:tcW w:type="dxa" w:w="1234"/>
+          </w:tcPr>
           <w:p>
             <w:r>
               <w:t>time limit (1)</w:t>
@@ -1094,6 +3338,50 @@
           <w:tcPr>
             <w:tcW w:type="dxa" w:w="1234"/>
           </w:tcPr>
+          <w:p/>
+        </w:tc>
+        <w:tc>
+          <w:tcPr>
+            <w:tcW w:type="dxa" w:w="1234"/>
+          </w:tcPr>
+          <w:p/>
+        </w:tc>
+        <w:tc>
+          <w:tcPr>
+            <w:tcW w:type="dxa" w:w="1234"/>
+          </w:tcPr>
+          <w:p/>
+        </w:tc>
+        <w:tc>
+          <w:tcPr>
+            <w:tcW w:type="dxa" w:w="1234"/>
+          </w:tcPr>
+          <w:p/>
+        </w:tc>
+        <w:tc>
+          <w:tcPr>
+            <w:tcW w:type="dxa" w:w="1234"/>
+          </w:tcPr>
+          <w:p/>
+        </w:tc>
+      </w:tr>
+      <w:tr>
+        <w:tc>
+          <w:tcPr>
+            <w:tcW w:type="dxa" w:w="1234"/>
+          </w:tcPr>
+          <w:p/>
+        </w:tc>
+        <w:tc>
+          <w:tcPr>
+            <w:tcW w:type="dxa" w:w="1234"/>
+          </w:tcPr>
+          <w:p/>
+        </w:tc>
+        <w:tc>
+          <w:tcPr>
+            <w:tcW w:type="dxa" w:w="1234"/>
+          </w:tcPr>
           <w:p>
             <w:r>
               <w:t>60.6 s</w:t>
@@ -1104,6 +3392,50 @@
           <w:tcPr>
             <w:tcW w:type="dxa" w:w="1234"/>
           </w:tcPr>
+          <w:p/>
+        </w:tc>
+        <w:tc>
+          <w:tcPr>
+            <w:tcW w:type="dxa" w:w="1234"/>
+          </w:tcPr>
+          <w:p/>
+        </w:tc>
+        <w:tc>
+          <w:tcPr>
+            <w:tcW w:type="dxa" w:w="1234"/>
+          </w:tcPr>
+          <w:p/>
+        </w:tc>
+        <w:tc>
+          <w:tcPr>
+            <w:tcW w:type="dxa" w:w="1234"/>
+          </w:tcPr>
+          <w:p/>
+        </w:tc>
+      </w:tr>
+      <w:tr>
+        <w:tc>
+          <w:tcPr>
+            <w:tcW w:type="dxa" w:w="1234"/>
+          </w:tcPr>
+          <w:p/>
+        </w:tc>
+        <w:tc>
+          <w:tcPr>
+            <w:tcW w:type="dxa" w:w="1234"/>
+          </w:tcPr>
+          <w:p/>
+        </w:tc>
+        <w:tc>
+          <w:tcPr>
+            <w:tcW w:type="dxa" w:w="1234"/>
+          </w:tcPr>
+          <w:p/>
+        </w:tc>
+        <w:tc>
+          <w:tcPr>
+            <w:tcW w:type="dxa" w:w="1234"/>
+          </w:tcPr>
           <w:p>
             <w:r>
               <w:t>1.4156</w:t>
@@ -1114,6 +3446,50 @@
           <w:tcPr>
             <w:tcW w:type="dxa" w:w="1234"/>
           </w:tcPr>
+          <w:p/>
+        </w:tc>
+        <w:tc>
+          <w:tcPr>
+            <w:tcW w:type="dxa" w:w="1234"/>
+          </w:tcPr>
+          <w:p/>
+        </w:tc>
+        <w:tc>
+          <w:tcPr>
+            <w:tcW w:type="dxa" w:w="1234"/>
+          </w:tcPr>
+          <w:p/>
+        </w:tc>
+      </w:tr>
+      <w:tr>
+        <w:tc>
+          <w:tcPr>
+            <w:tcW w:type="dxa" w:w="1234"/>
+          </w:tcPr>
+          <w:p/>
+        </w:tc>
+        <w:tc>
+          <w:tcPr>
+            <w:tcW w:type="dxa" w:w="1234"/>
+          </w:tcPr>
+          <w:p/>
+        </w:tc>
+        <w:tc>
+          <w:tcPr>
+            <w:tcW w:type="dxa" w:w="1234"/>
+          </w:tcPr>
+          <w:p/>
+        </w:tc>
+        <w:tc>
+          <w:tcPr>
+            <w:tcW w:type="dxa" w:w="1234"/>
+          </w:tcPr>
+          <w:p/>
+        </w:tc>
+        <w:tc>
+          <w:tcPr>
+            <w:tcW w:type="dxa" w:w="1234"/>
+          </w:tcPr>
           <w:p>
             <w:r>
               <w:t>optimal (0)</w:t>
@@ -1124,6 +3500,50 @@
           <w:tcPr>
             <w:tcW w:type="dxa" w:w="1234"/>
           </w:tcPr>
+          <w:p/>
+        </w:tc>
+        <w:tc>
+          <w:tcPr>
+            <w:tcW w:type="dxa" w:w="1234"/>
+          </w:tcPr>
+          <w:p/>
+        </w:tc>
+      </w:tr>
+      <w:tr>
+        <w:tc>
+          <w:tcPr>
+            <w:tcW w:type="dxa" w:w="1234"/>
+          </w:tcPr>
+          <w:p/>
+        </w:tc>
+        <w:tc>
+          <w:tcPr>
+            <w:tcW w:type="dxa" w:w="1234"/>
+          </w:tcPr>
+          <w:p/>
+        </w:tc>
+        <w:tc>
+          <w:tcPr>
+            <w:tcW w:type="dxa" w:w="1234"/>
+          </w:tcPr>
+          <w:p/>
+        </w:tc>
+        <w:tc>
+          <w:tcPr>
+            <w:tcW w:type="dxa" w:w="1234"/>
+          </w:tcPr>
+          <w:p/>
+        </w:tc>
+        <w:tc>
+          <w:tcPr>
+            <w:tcW w:type="dxa" w:w="1234"/>
+          </w:tcPr>
+          <w:p/>
+        </w:tc>
+        <w:tc>
+          <w:tcPr>
+            <w:tcW w:type="dxa" w:w="1234"/>
+          </w:tcPr>
           <w:p>
             <w:r>
               <w:t>1.4226</w:t>
@@ -1134,6 +3554,50 @@
           <w:tcPr>
             <w:tcW w:type="dxa" w:w="1234"/>
           </w:tcPr>
+          <w:p/>
+        </w:tc>
+      </w:tr>
+      <w:tr>
+        <w:tc>
+          <w:tcPr>
+            <w:tcW w:type="dxa" w:w="1234"/>
+          </w:tcPr>
+          <w:p/>
+        </w:tc>
+        <w:tc>
+          <w:tcPr>
+            <w:tcW w:type="dxa" w:w="1234"/>
+          </w:tcPr>
+          <w:p/>
+        </w:tc>
+        <w:tc>
+          <w:tcPr>
+            <w:tcW w:type="dxa" w:w="1234"/>
+          </w:tcPr>
+          <w:p/>
+        </w:tc>
+        <w:tc>
+          <w:tcPr>
+            <w:tcW w:type="dxa" w:w="1234"/>
+          </w:tcPr>
+          <w:p/>
+        </w:tc>
+        <w:tc>
+          <w:tcPr>
+            <w:tcW w:type="dxa" w:w="1234"/>
+          </w:tcPr>
+          <w:p/>
+        </w:tc>
+        <w:tc>
+          <w:tcPr>
+            <w:tcW w:type="dxa" w:w="1234"/>
+          </w:tcPr>
+          <w:p/>
+        </w:tc>
+        <w:tc>
+          <w:tcPr>
+            <w:tcW w:type="dxa" w:w="1234"/>
+          </w:tcPr>
           <w:p>
             <w:r>
               <w:t>1.4226</w:t>
@@ -1156,6 +3620,50 @@
           <w:tcPr>
             <w:tcW w:type="dxa" w:w="1234"/>
           </w:tcPr>
+          <w:p/>
+        </w:tc>
+        <w:tc>
+          <w:tcPr>
+            <w:tcW w:type="dxa" w:w="1234"/>
+          </w:tcPr>
+          <w:p/>
+        </w:tc>
+        <w:tc>
+          <w:tcPr>
+            <w:tcW w:type="dxa" w:w="1234"/>
+          </w:tcPr>
+          <w:p/>
+        </w:tc>
+        <w:tc>
+          <w:tcPr>
+            <w:tcW w:type="dxa" w:w="1234"/>
+          </w:tcPr>
+          <w:p/>
+        </w:tc>
+        <w:tc>
+          <w:tcPr>
+            <w:tcW w:type="dxa" w:w="1234"/>
+          </w:tcPr>
+          <w:p/>
+        </w:tc>
+        <w:tc>
+          <w:tcPr>
+            <w:tcW w:type="dxa" w:w="1234"/>
+          </w:tcPr>
+          <w:p/>
+        </w:tc>
+      </w:tr>
+      <w:tr>
+        <w:tc>
+          <w:tcPr>
+            <w:tcW w:type="dxa" w:w="1234"/>
+          </w:tcPr>
+          <w:p/>
+        </w:tc>
+        <w:tc>
+          <w:tcPr>
+            <w:tcW w:type="dxa" w:w="1234"/>
+          </w:tcPr>
           <w:p>
             <w:r>
               <w:t>optimal (0)</w:t>
@@ -1166,6 +3674,50 @@
           <w:tcPr>
             <w:tcW w:type="dxa" w:w="1234"/>
           </w:tcPr>
+          <w:p/>
+        </w:tc>
+        <w:tc>
+          <w:tcPr>
+            <w:tcW w:type="dxa" w:w="1234"/>
+          </w:tcPr>
+          <w:p/>
+        </w:tc>
+        <w:tc>
+          <w:tcPr>
+            <w:tcW w:type="dxa" w:w="1234"/>
+          </w:tcPr>
+          <w:p/>
+        </w:tc>
+        <w:tc>
+          <w:tcPr>
+            <w:tcW w:type="dxa" w:w="1234"/>
+          </w:tcPr>
+          <w:p/>
+        </w:tc>
+        <w:tc>
+          <w:tcPr>
+            <w:tcW w:type="dxa" w:w="1234"/>
+          </w:tcPr>
+          <w:p/>
+        </w:tc>
+      </w:tr>
+      <w:tr>
+        <w:tc>
+          <w:tcPr>
+            <w:tcW w:type="dxa" w:w="1234"/>
+          </w:tcPr>
+          <w:p/>
+        </w:tc>
+        <w:tc>
+          <w:tcPr>
+            <w:tcW w:type="dxa" w:w="1234"/>
+          </w:tcPr>
+          <w:p/>
+        </w:tc>
+        <w:tc>
+          <w:tcPr>
+            <w:tcW w:type="dxa" w:w="1234"/>
+          </w:tcPr>
           <w:p>
             <w:r>
               <w:t>0.7 s</w:t>
@@ -1176,6 +3728,50 @@
           <w:tcPr>
             <w:tcW w:type="dxa" w:w="1234"/>
           </w:tcPr>
+          <w:p/>
+        </w:tc>
+        <w:tc>
+          <w:tcPr>
+            <w:tcW w:type="dxa" w:w="1234"/>
+          </w:tcPr>
+          <w:p/>
+        </w:tc>
+        <w:tc>
+          <w:tcPr>
+            <w:tcW w:type="dxa" w:w="1234"/>
+          </w:tcPr>
+          <w:p/>
+        </w:tc>
+        <w:tc>
+          <w:tcPr>
+            <w:tcW w:type="dxa" w:w="1234"/>
+          </w:tcPr>
+          <w:p/>
+        </w:tc>
+      </w:tr>
+      <w:tr>
+        <w:tc>
+          <w:tcPr>
+            <w:tcW w:type="dxa" w:w="1234"/>
+          </w:tcPr>
+          <w:p/>
+        </w:tc>
+        <w:tc>
+          <w:tcPr>
+            <w:tcW w:type="dxa" w:w="1234"/>
+          </w:tcPr>
+          <w:p/>
+        </w:tc>
+        <w:tc>
+          <w:tcPr>
+            <w:tcW w:type="dxa" w:w="1234"/>
+          </w:tcPr>
+          <w:p/>
+        </w:tc>
+        <w:tc>
+          <w:tcPr>
+            <w:tcW w:type="dxa" w:w="1234"/>
+          </w:tcPr>
           <w:p>
             <w:r>
               <w:t>1.4369</w:t>
@@ -1186,6 +3782,50 @@
           <w:tcPr>
             <w:tcW w:type="dxa" w:w="1234"/>
           </w:tcPr>
+          <w:p/>
+        </w:tc>
+        <w:tc>
+          <w:tcPr>
+            <w:tcW w:type="dxa" w:w="1234"/>
+          </w:tcPr>
+          <w:p/>
+        </w:tc>
+        <w:tc>
+          <w:tcPr>
+            <w:tcW w:type="dxa" w:w="1234"/>
+          </w:tcPr>
+          <w:p/>
+        </w:tc>
+      </w:tr>
+      <w:tr>
+        <w:tc>
+          <w:tcPr>
+            <w:tcW w:type="dxa" w:w="1234"/>
+          </w:tcPr>
+          <w:p/>
+        </w:tc>
+        <w:tc>
+          <w:tcPr>
+            <w:tcW w:type="dxa" w:w="1234"/>
+          </w:tcPr>
+          <w:p/>
+        </w:tc>
+        <w:tc>
+          <w:tcPr>
+            <w:tcW w:type="dxa" w:w="1234"/>
+          </w:tcPr>
+          <w:p/>
+        </w:tc>
+        <w:tc>
+          <w:tcPr>
+            <w:tcW w:type="dxa" w:w="1234"/>
+          </w:tcPr>
+          <w:p/>
+        </w:tc>
+        <w:tc>
+          <w:tcPr>
+            <w:tcW w:type="dxa" w:w="1234"/>
+          </w:tcPr>
           <w:p>
             <w:r>
               <w:t>optimal (0)</w:t>
@@ -1196,6 +3836,50 @@
           <w:tcPr>
             <w:tcW w:type="dxa" w:w="1234"/>
           </w:tcPr>
+          <w:p/>
+        </w:tc>
+        <w:tc>
+          <w:tcPr>
+            <w:tcW w:type="dxa" w:w="1234"/>
+          </w:tcPr>
+          <w:p/>
+        </w:tc>
+      </w:tr>
+      <w:tr>
+        <w:tc>
+          <w:tcPr>
+            <w:tcW w:type="dxa" w:w="1234"/>
+          </w:tcPr>
+          <w:p/>
+        </w:tc>
+        <w:tc>
+          <w:tcPr>
+            <w:tcW w:type="dxa" w:w="1234"/>
+          </w:tcPr>
+          <w:p/>
+        </w:tc>
+        <w:tc>
+          <w:tcPr>
+            <w:tcW w:type="dxa" w:w="1234"/>
+          </w:tcPr>
+          <w:p/>
+        </w:tc>
+        <w:tc>
+          <w:tcPr>
+            <w:tcW w:type="dxa" w:w="1234"/>
+          </w:tcPr>
+          <w:p/>
+        </w:tc>
+        <w:tc>
+          <w:tcPr>
+            <w:tcW w:type="dxa" w:w="1234"/>
+          </w:tcPr>
+          <w:p/>
+        </w:tc>
+        <w:tc>
+          <w:tcPr>
+            <w:tcW w:type="dxa" w:w="1234"/>
+          </w:tcPr>
           <w:p>
             <w:r>
               <w:t>1.4370*</w:t>
@@ -1206,6 +3890,50 @@
           <w:tcPr>
             <w:tcW w:type="dxa" w:w="1234"/>
           </w:tcPr>
+          <w:p/>
+        </w:tc>
+      </w:tr>
+      <w:tr>
+        <w:tc>
+          <w:tcPr>
+            <w:tcW w:type="dxa" w:w="1234"/>
+          </w:tcPr>
+          <w:p/>
+        </w:tc>
+        <w:tc>
+          <w:tcPr>
+            <w:tcW w:type="dxa" w:w="1234"/>
+          </w:tcPr>
+          <w:p/>
+        </w:tc>
+        <w:tc>
+          <w:tcPr>
+            <w:tcW w:type="dxa" w:w="1234"/>
+          </w:tcPr>
+          <w:p/>
+        </w:tc>
+        <w:tc>
+          <w:tcPr>
+            <w:tcW w:type="dxa" w:w="1234"/>
+          </w:tcPr>
+          <w:p/>
+        </w:tc>
+        <w:tc>
+          <w:tcPr>
+            <w:tcW w:type="dxa" w:w="1234"/>
+          </w:tcPr>
+          <w:p/>
+        </w:tc>
+        <w:tc>
+          <w:tcPr>
+            <w:tcW w:type="dxa" w:w="1234"/>
+          </w:tcPr>
+          <w:p/>
+        </w:tc>
+        <w:tc>
+          <w:tcPr>
+            <w:tcW w:type="dxa" w:w="1234"/>
+          </w:tcPr>
           <w:p>
             <w:r>
               <w:t>1.4370</w:t>
@@ -1228,6 +3956,50 @@
           <w:tcPr>
             <w:tcW w:type="dxa" w:w="1234"/>
           </w:tcPr>
+          <w:p/>
+        </w:tc>
+        <w:tc>
+          <w:tcPr>
+            <w:tcW w:type="dxa" w:w="1234"/>
+          </w:tcPr>
+          <w:p/>
+        </w:tc>
+        <w:tc>
+          <w:tcPr>
+            <w:tcW w:type="dxa" w:w="1234"/>
+          </w:tcPr>
+          <w:p/>
+        </w:tc>
+        <w:tc>
+          <w:tcPr>
+            <w:tcW w:type="dxa" w:w="1234"/>
+          </w:tcPr>
+          <w:p/>
+        </w:tc>
+        <w:tc>
+          <w:tcPr>
+            <w:tcW w:type="dxa" w:w="1234"/>
+          </w:tcPr>
+          <w:p/>
+        </w:tc>
+        <w:tc>
+          <w:tcPr>
+            <w:tcW w:type="dxa" w:w="1234"/>
+          </w:tcPr>
+          <w:p/>
+        </w:tc>
+      </w:tr>
+      <w:tr>
+        <w:tc>
+          <w:tcPr>
+            <w:tcW w:type="dxa" w:w="1234"/>
+          </w:tcPr>
+          <w:p/>
+        </w:tc>
+        <w:tc>
+          <w:tcPr>
+            <w:tcW w:type="dxa" w:w="1234"/>
+          </w:tcPr>
           <w:p>
             <w:r>
               <w:t>time limit (1)</w:t>
@@ -1238,6 +4010,50 @@
           <w:tcPr>
             <w:tcW w:type="dxa" w:w="1234"/>
           </w:tcPr>
+          <w:p/>
+        </w:tc>
+        <w:tc>
+          <w:tcPr>
+            <w:tcW w:type="dxa" w:w="1234"/>
+          </w:tcPr>
+          <w:p/>
+        </w:tc>
+        <w:tc>
+          <w:tcPr>
+            <w:tcW w:type="dxa" w:w="1234"/>
+          </w:tcPr>
+          <w:p/>
+        </w:tc>
+        <w:tc>
+          <w:tcPr>
+            <w:tcW w:type="dxa" w:w="1234"/>
+          </w:tcPr>
+          <w:p/>
+        </w:tc>
+        <w:tc>
+          <w:tcPr>
+            <w:tcW w:type="dxa" w:w="1234"/>
+          </w:tcPr>
+          <w:p/>
+        </w:tc>
+      </w:tr>
+      <w:tr>
+        <w:tc>
+          <w:tcPr>
+            <w:tcW w:type="dxa" w:w="1234"/>
+          </w:tcPr>
+          <w:p/>
+        </w:tc>
+        <w:tc>
+          <w:tcPr>
+            <w:tcW w:type="dxa" w:w="1234"/>
+          </w:tcPr>
+          <w:p/>
+        </w:tc>
+        <w:tc>
+          <w:tcPr>
+            <w:tcW w:type="dxa" w:w="1234"/>
+          </w:tcPr>
           <w:p>
             <w:r>
               <w:t>61.4 s</w:t>
@@ -1248,6 +4064,50 @@
           <w:tcPr>
             <w:tcW w:type="dxa" w:w="1234"/>
           </w:tcPr>
+          <w:p/>
+        </w:tc>
+        <w:tc>
+          <w:tcPr>
+            <w:tcW w:type="dxa" w:w="1234"/>
+          </w:tcPr>
+          <w:p/>
+        </w:tc>
+        <w:tc>
+          <w:tcPr>
+            <w:tcW w:type="dxa" w:w="1234"/>
+          </w:tcPr>
+          <w:p/>
+        </w:tc>
+        <w:tc>
+          <w:tcPr>
+            <w:tcW w:type="dxa" w:w="1234"/>
+          </w:tcPr>
+          <w:p/>
+        </w:tc>
+      </w:tr>
+      <w:tr>
+        <w:tc>
+          <w:tcPr>
+            <w:tcW w:type="dxa" w:w="1234"/>
+          </w:tcPr>
+          <w:p/>
+        </w:tc>
+        <w:tc>
+          <w:tcPr>
+            <w:tcW w:type="dxa" w:w="1234"/>
+          </w:tcPr>
+          <w:p/>
+        </w:tc>
+        <w:tc>
+          <w:tcPr>
+            <w:tcW w:type="dxa" w:w="1234"/>
+          </w:tcPr>
+          <w:p/>
+        </w:tc>
+        <w:tc>
+          <w:tcPr>
+            <w:tcW w:type="dxa" w:w="1234"/>
+          </w:tcPr>
           <w:p>
             <w:r>
               <w:t>1.3412</w:t>
@@ -1258,6 +4118,50 @@
           <w:tcPr>
             <w:tcW w:type="dxa" w:w="1234"/>
           </w:tcPr>
+          <w:p/>
+        </w:tc>
+        <w:tc>
+          <w:tcPr>
+            <w:tcW w:type="dxa" w:w="1234"/>
+          </w:tcPr>
+          <w:p/>
+        </w:tc>
+        <w:tc>
+          <w:tcPr>
+            <w:tcW w:type="dxa" w:w="1234"/>
+          </w:tcPr>
+          <w:p/>
+        </w:tc>
+      </w:tr>
+      <w:tr>
+        <w:tc>
+          <w:tcPr>
+            <w:tcW w:type="dxa" w:w="1234"/>
+          </w:tcPr>
+          <w:p/>
+        </w:tc>
+        <w:tc>
+          <w:tcPr>
+            <w:tcW w:type="dxa" w:w="1234"/>
+          </w:tcPr>
+          <w:p/>
+        </w:tc>
+        <w:tc>
+          <w:tcPr>
+            <w:tcW w:type="dxa" w:w="1234"/>
+          </w:tcPr>
+          <w:p/>
+        </w:tc>
+        <w:tc>
+          <w:tcPr>
+            <w:tcW w:type="dxa" w:w="1234"/>
+          </w:tcPr>
+          <w:p/>
+        </w:tc>
+        <w:tc>
+          <w:tcPr>
+            <w:tcW w:type="dxa" w:w="1234"/>
+          </w:tcPr>
           <w:p>
             <w:r>
               <w:t>optimal (0)</w:t>
@@ -1268,6 +4172,50 @@
           <w:tcPr>
             <w:tcW w:type="dxa" w:w="1234"/>
           </w:tcPr>
+          <w:p/>
+        </w:tc>
+        <w:tc>
+          <w:tcPr>
+            <w:tcW w:type="dxa" w:w="1234"/>
+          </w:tcPr>
+          <w:p/>
+        </w:tc>
+      </w:tr>
+      <w:tr>
+        <w:tc>
+          <w:tcPr>
+            <w:tcW w:type="dxa" w:w="1234"/>
+          </w:tcPr>
+          <w:p/>
+        </w:tc>
+        <w:tc>
+          <w:tcPr>
+            <w:tcW w:type="dxa" w:w="1234"/>
+          </w:tcPr>
+          <w:p/>
+        </w:tc>
+        <w:tc>
+          <w:tcPr>
+            <w:tcW w:type="dxa" w:w="1234"/>
+          </w:tcPr>
+          <w:p/>
+        </w:tc>
+        <w:tc>
+          <w:tcPr>
+            <w:tcW w:type="dxa" w:w="1234"/>
+          </w:tcPr>
+          <w:p/>
+        </w:tc>
+        <w:tc>
+          <w:tcPr>
+            <w:tcW w:type="dxa" w:w="1234"/>
+          </w:tcPr>
+          <w:p/>
+        </w:tc>
+        <w:tc>
+          <w:tcPr>
+            <w:tcW w:type="dxa" w:w="1234"/>
+          </w:tcPr>
           <w:p>
             <w:r>
               <w:t>1.3464</w:t>
@@ -1278,6 +4226,50 @@
           <w:tcPr>
             <w:tcW w:type="dxa" w:w="1234"/>
           </w:tcPr>
+          <w:p/>
+        </w:tc>
+      </w:tr>
+      <w:tr>
+        <w:tc>
+          <w:tcPr>
+            <w:tcW w:type="dxa" w:w="1234"/>
+          </w:tcPr>
+          <w:p/>
+        </w:tc>
+        <w:tc>
+          <w:tcPr>
+            <w:tcW w:type="dxa" w:w="1234"/>
+          </w:tcPr>
+          <w:p/>
+        </w:tc>
+        <w:tc>
+          <w:tcPr>
+            <w:tcW w:type="dxa" w:w="1234"/>
+          </w:tcPr>
+          <w:p/>
+        </w:tc>
+        <w:tc>
+          <w:tcPr>
+            <w:tcW w:type="dxa" w:w="1234"/>
+          </w:tcPr>
+          <w:p/>
+        </w:tc>
+        <w:tc>
+          <w:tcPr>
+            <w:tcW w:type="dxa" w:w="1234"/>
+          </w:tcPr>
+          <w:p/>
+        </w:tc>
+        <w:tc>
+          <w:tcPr>
+            <w:tcW w:type="dxa" w:w="1234"/>
+          </w:tcPr>
+          <w:p/>
+        </w:tc>
+        <w:tc>
+          <w:tcPr>
+            <w:tcW w:type="dxa" w:w="1234"/>
+          </w:tcPr>
           <w:p>
             <w:r>
               <w:t>1.3464</w:t>
@@ -1300,6 +4292,50 @@
           <w:tcPr>
             <w:tcW w:type="dxa" w:w="1234"/>
           </w:tcPr>
+          <w:p/>
+        </w:tc>
+        <w:tc>
+          <w:tcPr>
+            <w:tcW w:type="dxa" w:w="1234"/>
+          </w:tcPr>
+          <w:p/>
+        </w:tc>
+        <w:tc>
+          <w:tcPr>
+            <w:tcW w:type="dxa" w:w="1234"/>
+          </w:tcPr>
+          <w:p/>
+        </w:tc>
+        <w:tc>
+          <w:tcPr>
+            <w:tcW w:type="dxa" w:w="1234"/>
+          </w:tcPr>
+          <w:p/>
+        </w:tc>
+        <w:tc>
+          <w:tcPr>
+            <w:tcW w:type="dxa" w:w="1234"/>
+          </w:tcPr>
+          <w:p/>
+        </w:tc>
+        <w:tc>
+          <w:tcPr>
+            <w:tcW w:type="dxa" w:w="1234"/>
+          </w:tcPr>
+          <w:p/>
+        </w:tc>
+      </w:tr>
+      <w:tr>
+        <w:tc>
+          <w:tcPr>
+            <w:tcW w:type="dxa" w:w="1234"/>
+          </w:tcPr>
+          <w:p/>
+        </w:tc>
+        <w:tc>
+          <w:tcPr>
+            <w:tcW w:type="dxa" w:w="1234"/>
+          </w:tcPr>
           <w:p>
             <w:r>
               <w:t>optimal (0)</w:t>
@@ -1310,6 +4346,50 @@
           <w:tcPr>
             <w:tcW w:type="dxa" w:w="1234"/>
           </w:tcPr>
+          <w:p/>
+        </w:tc>
+        <w:tc>
+          <w:tcPr>
+            <w:tcW w:type="dxa" w:w="1234"/>
+          </w:tcPr>
+          <w:p/>
+        </w:tc>
+        <w:tc>
+          <w:tcPr>
+            <w:tcW w:type="dxa" w:w="1234"/>
+          </w:tcPr>
+          <w:p/>
+        </w:tc>
+        <w:tc>
+          <w:tcPr>
+            <w:tcW w:type="dxa" w:w="1234"/>
+          </w:tcPr>
+          <w:p/>
+        </w:tc>
+        <w:tc>
+          <w:tcPr>
+            <w:tcW w:type="dxa" w:w="1234"/>
+          </w:tcPr>
+          <w:p/>
+        </w:tc>
+      </w:tr>
+      <w:tr>
+        <w:tc>
+          <w:tcPr>
+            <w:tcW w:type="dxa" w:w="1234"/>
+          </w:tcPr>
+          <w:p/>
+        </w:tc>
+        <w:tc>
+          <w:tcPr>
+            <w:tcW w:type="dxa" w:w="1234"/>
+          </w:tcPr>
+          <w:p/>
+        </w:tc>
+        <w:tc>
+          <w:tcPr>
+            <w:tcW w:type="dxa" w:w="1234"/>
+          </w:tcPr>
           <w:p>
             <w:r>
               <w:t>35.5 s</w:t>
@@ -1320,6 +4400,50 @@
           <w:tcPr>
             <w:tcW w:type="dxa" w:w="1234"/>
           </w:tcPr>
+          <w:p/>
+        </w:tc>
+        <w:tc>
+          <w:tcPr>
+            <w:tcW w:type="dxa" w:w="1234"/>
+          </w:tcPr>
+          <w:p/>
+        </w:tc>
+        <w:tc>
+          <w:tcPr>
+            <w:tcW w:type="dxa" w:w="1234"/>
+          </w:tcPr>
+          <w:p/>
+        </w:tc>
+        <w:tc>
+          <w:tcPr>
+            <w:tcW w:type="dxa" w:w="1234"/>
+          </w:tcPr>
+          <w:p/>
+        </w:tc>
+      </w:tr>
+      <w:tr>
+        <w:tc>
+          <w:tcPr>
+            <w:tcW w:type="dxa" w:w="1234"/>
+          </w:tcPr>
+          <w:p/>
+        </w:tc>
+        <w:tc>
+          <w:tcPr>
+            <w:tcW w:type="dxa" w:w="1234"/>
+          </w:tcPr>
+          <w:p/>
+        </w:tc>
+        <w:tc>
+          <w:tcPr>
+            <w:tcW w:type="dxa" w:w="1234"/>
+          </w:tcPr>
+          <w:p/>
+        </w:tc>
+        <w:tc>
+          <w:tcPr>
+            <w:tcW w:type="dxa" w:w="1234"/>
+          </w:tcPr>
           <w:p>
             <w:r>
               <w:t>1.4043</w:t>
@@ -1330,6 +4454,50 @@
           <w:tcPr>
             <w:tcW w:type="dxa" w:w="1234"/>
           </w:tcPr>
+          <w:p/>
+        </w:tc>
+        <w:tc>
+          <w:tcPr>
+            <w:tcW w:type="dxa" w:w="1234"/>
+          </w:tcPr>
+          <w:p/>
+        </w:tc>
+        <w:tc>
+          <w:tcPr>
+            <w:tcW w:type="dxa" w:w="1234"/>
+          </w:tcPr>
+          <w:p/>
+        </w:tc>
+      </w:tr>
+      <w:tr>
+        <w:tc>
+          <w:tcPr>
+            <w:tcW w:type="dxa" w:w="1234"/>
+          </w:tcPr>
+          <w:p/>
+        </w:tc>
+        <w:tc>
+          <w:tcPr>
+            <w:tcW w:type="dxa" w:w="1234"/>
+          </w:tcPr>
+          <w:p/>
+        </w:tc>
+        <w:tc>
+          <w:tcPr>
+            <w:tcW w:type="dxa" w:w="1234"/>
+          </w:tcPr>
+          <w:p/>
+        </w:tc>
+        <w:tc>
+          <w:tcPr>
+            <w:tcW w:type="dxa" w:w="1234"/>
+          </w:tcPr>
+          <w:p/>
+        </w:tc>
+        <w:tc>
+          <w:tcPr>
+            <w:tcW w:type="dxa" w:w="1234"/>
+          </w:tcPr>
           <w:p>
             <w:r>
               <w:t>optimal (0)</w:t>
@@ -1340,6 +4508,50 @@
           <w:tcPr>
             <w:tcW w:type="dxa" w:w="1234"/>
           </w:tcPr>
+          <w:p/>
+        </w:tc>
+        <w:tc>
+          <w:tcPr>
+            <w:tcW w:type="dxa" w:w="1234"/>
+          </w:tcPr>
+          <w:p/>
+        </w:tc>
+      </w:tr>
+      <w:tr>
+        <w:tc>
+          <w:tcPr>
+            <w:tcW w:type="dxa" w:w="1234"/>
+          </w:tcPr>
+          <w:p/>
+        </w:tc>
+        <w:tc>
+          <w:tcPr>
+            <w:tcW w:type="dxa" w:w="1234"/>
+          </w:tcPr>
+          <w:p/>
+        </w:tc>
+        <w:tc>
+          <w:tcPr>
+            <w:tcW w:type="dxa" w:w="1234"/>
+          </w:tcPr>
+          <w:p/>
+        </w:tc>
+        <w:tc>
+          <w:tcPr>
+            <w:tcW w:type="dxa" w:w="1234"/>
+          </w:tcPr>
+          <w:p/>
+        </w:tc>
+        <w:tc>
+          <w:tcPr>
+            <w:tcW w:type="dxa" w:w="1234"/>
+          </w:tcPr>
+          <w:p/>
+        </w:tc>
+        <w:tc>
+          <w:tcPr>
+            <w:tcW w:type="dxa" w:w="1234"/>
+          </w:tcPr>
           <w:p>
             <w:r>
               <w:t>1.4044*</w:t>
@@ -1350,6 +4562,50 @@
           <w:tcPr>
             <w:tcW w:type="dxa" w:w="1234"/>
           </w:tcPr>
+          <w:p/>
+        </w:tc>
+      </w:tr>
+      <w:tr>
+        <w:tc>
+          <w:tcPr>
+            <w:tcW w:type="dxa" w:w="1234"/>
+          </w:tcPr>
+          <w:p/>
+        </w:tc>
+        <w:tc>
+          <w:tcPr>
+            <w:tcW w:type="dxa" w:w="1234"/>
+          </w:tcPr>
+          <w:p/>
+        </w:tc>
+        <w:tc>
+          <w:tcPr>
+            <w:tcW w:type="dxa" w:w="1234"/>
+          </w:tcPr>
+          <w:p/>
+        </w:tc>
+        <w:tc>
+          <w:tcPr>
+            <w:tcW w:type="dxa" w:w="1234"/>
+          </w:tcPr>
+          <w:p/>
+        </w:tc>
+        <w:tc>
+          <w:tcPr>
+            <w:tcW w:type="dxa" w:w="1234"/>
+          </w:tcPr>
+          <w:p/>
+        </w:tc>
+        <w:tc>
+          <w:tcPr>
+            <w:tcW w:type="dxa" w:w="1234"/>
+          </w:tcPr>
+          <w:p/>
+        </w:tc>
+        <w:tc>
+          <w:tcPr>
+            <w:tcW w:type="dxa" w:w="1234"/>
+          </w:tcPr>
           <w:p>
             <w:r>
               <w:t>1.4044</w:t>
@@ -1372,6 +4628,50 @@
           <w:tcPr>
             <w:tcW w:type="dxa" w:w="1234"/>
           </w:tcPr>
+          <w:p/>
+        </w:tc>
+        <w:tc>
+          <w:tcPr>
+            <w:tcW w:type="dxa" w:w="1234"/>
+          </w:tcPr>
+          <w:p/>
+        </w:tc>
+        <w:tc>
+          <w:tcPr>
+            <w:tcW w:type="dxa" w:w="1234"/>
+          </w:tcPr>
+          <w:p/>
+        </w:tc>
+        <w:tc>
+          <w:tcPr>
+            <w:tcW w:type="dxa" w:w="1234"/>
+          </w:tcPr>
+          <w:p/>
+        </w:tc>
+        <w:tc>
+          <w:tcPr>
+            <w:tcW w:type="dxa" w:w="1234"/>
+          </w:tcPr>
+          <w:p/>
+        </w:tc>
+        <w:tc>
+          <w:tcPr>
+            <w:tcW w:type="dxa" w:w="1234"/>
+          </w:tcPr>
+          <w:p/>
+        </w:tc>
+      </w:tr>
+      <w:tr>
+        <w:tc>
+          <w:tcPr>
+            <w:tcW w:type="dxa" w:w="1234"/>
+          </w:tcPr>
+          <w:p/>
+        </w:tc>
+        <w:tc>
+          <w:tcPr>
+            <w:tcW w:type="dxa" w:w="1234"/>
+          </w:tcPr>
           <w:p>
             <w:r>
               <w:t>time limit (1)</w:t>
@@ -1382,6 +4682,50 @@
           <w:tcPr>
             <w:tcW w:type="dxa" w:w="1234"/>
           </w:tcPr>
+          <w:p/>
+        </w:tc>
+        <w:tc>
+          <w:tcPr>
+            <w:tcW w:type="dxa" w:w="1234"/>
+          </w:tcPr>
+          <w:p/>
+        </w:tc>
+        <w:tc>
+          <w:tcPr>
+            <w:tcW w:type="dxa" w:w="1234"/>
+          </w:tcPr>
+          <w:p/>
+        </w:tc>
+        <w:tc>
+          <w:tcPr>
+            <w:tcW w:type="dxa" w:w="1234"/>
+          </w:tcPr>
+          <w:p/>
+        </w:tc>
+        <w:tc>
+          <w:tcPr>
+            <w:tcW w:type="dxa" w:w="1234"/>
+          </w:tcPr>
+          <w:p/>
+        </w:tc>
+      </w:tr>
+      <w:tr>
+        <w:tc>
+          <w:tcPr>
+            <w:tcW w:type="dxa" w:w="1234"/>
+          </w:tcPr>
+          <w:p/>
+        </w:tc>
+        <w:tc>
+          <w:tcPr>
+            <w:tcW w:type="dxa" w:w="1234"/>
+          </w:tcPr>
+          <w:p/>
+        </w:tc>
+        <w:tc>
+          <w:tcPr>
+            <w:tcW w:type="dxa" w:w="1234"/>
+          </w:tcPr>
           <w:p>
             <w:r>
               <w:t>61.4 s</w:t>
@@ -1392,6 +4736,50 @@
           <w:tcPr>
             <w:tcW w:type="dxa" w:w="1234"/>
           </w:tcPr>
+          <w:p/>
+        </w:tc>
+        <w:tc>
+          <w:tcPr>
+            <w:tcW w:type="dxa" w:w="1234"/>
+          </w:tcPr>
+          <w:p/>
+        </w:tc>
+        <w:tc>
+          <w:tcPr>
+            <w:tcW w:type="dxa" w:w="1234"/>
+          </w:tcPr>
+          <w:p/>
+        </w:tc>
+        <w:tc>
+          <w:tcPr>
+            <w:tcW w:type="dxa" w:w="1234"/>
+          </w:tcPr>
+          <w:p/>
+        </w:tc>
+      </w:tr>
+      <w:tr>
+        <w:tc>
+          <w:tcPr>
+            <w:tcW w:type="dxa" w:w="1234"/>
+          </w:tcPr>
+          <w:p/>
+        </w:tc>
+        <w:tc>
+          <w:tcPr>
+            <w:tcW w:type="dxa" w:w="1234"/>
+          </w:tcPr>
+          <w:p/>
+        </w:tc>
+        <w:tc>
+          <w:tcPr>
+            <w:tcW w:type="dxa" w:w="1234"/>
+          </w:tcPr>
+          <w:p/>
+        </w:tc>
+        <w:tc>
+          <w:tcPr>
+            <w:tcW w:type="dxa" w:w="1234"/>
+          </w:tcPr>
           <w:p>
             <w:r>
               <w:t>1.4276</w:t>
@@ -1402,6 +4790,50 @@
           <w:tcPr>
             <w:tcW w:type="dxa" w:w="1234"/>
           </w:tcPr>
+          <w:p/>
+        </w:tc>
+        <w:tc>
+          <w:tcPr>
+            <w:tcW w:type="dxa" w:w="1234"/>
+          </w:tcPr>
+          <w:p/>
+        </w:tc>
+        <w:tc>
+          <w:tcPr>
+            <w:tcW w:type="dxa" w:w="1234"/>
+          </w:tcPr>
+          <w:p/>
+        </w:tc>
+      </w:tr>
+      <w:tr>
+        <w:tc>
+          <w:tcPr>
+            <w:tcW w:type="dxa" w:w="1234"/>
+          </w:tcPr>
+          <w:p/>
+        </w:tc>
+        <w:tc>
+          <w:tcPr>
+            <w:tcW w:type="dxa" w:w="1234"/>
+          </w:tcPr>
+          <w:p/>
+        </w:tc>
+        <w:tc>
+          <w:tcPr>
+            <w:tcW w:type="dxa" w:w="1234"/>
+          </w:tcPr>
+          <w:p/>
+        </w:tc>
+        <w:tc>
+          <w:tcPr>
+            <w:tcW w:type="dxa" w:w="1234"/>
+          </w:tcPr>
+          <w:p/>
+        </w:tc>
+        <w:tc>
+          <w:tcPr>
+            <w:tcW w:type="dxa" w:w="1234"/>
+          </w:tcPr>
           <w:p>
             <w:r>
               <w:t>optimal (0)</w:t>
@@ -1412,6 +4844,50 @@
           <w:tcPr>
             <w:tcW w:type="dxa" w:w="1234"/>
           </w:tcPr>
+          <w:p/>
+        </w:tc>
+        <w:tc>
+          <w:tcPr>
+            <w:tcW w:type="dxa" w:w="1234"/>
+          </w:tcPr>
+          <w:p/>
+        </w:tc>
+      </w:tr>
+      <w:tr>
+        <w:tc>
+          <w:tcPr>
+            <w:tcW w:type="dxa" w:w="1234"/>
+          </w:tcPr>
+          <w:p/>
+        </w:tc>
+        <w:tc>
+          <w:tcPr>
+            <w:tcW w:type="dxa" w:w="1234"/>
+          </w:tcPr>
+          <w:p/>
+        </w:tc>
+        <w:tc>
+          <w:tcPr>
+            <w:tcW w:type="dxa" w:w="1234"/>
+          </w:tcPr>
+          <w:p/>
+        </w:tc>
+        <w:tc>
+          <w:tcPr>
+            <w:tcW w:type="dxa" w:w="1234"/>
+          </w:tcPr>
+          <w:p/>
+        </w:tc>
+        <w:tc>
+          <w:tcPr>
+            <w:tcW w:type="dxa" w:w="1234"/>
+          </w:tcPr>
+          <w:p/>
+        </w:tc>
+        <w:tc>
+          <w:tcPr>
+            <w:tcW w:type="dxa" w:w="1234"/>
+          </w:tcPr>
           <w:p>
             <w:r>
               <w:t>1.4322</w:t>
@@ -1422,6 +4898,50 @@
           <w:tcPr>
             <w:tcW w:type="dxa" w:w="1234"/>
           </w:tcPr>
+          <w:p/>
+        </w:tc>
+      </w:tr>
+      <w:tr>
+        <w:tc>
+          <w:tcPr>
+            <w:tcW w:type="dxa" w:w="1234"/>
+          </w:tcPr>
+          <w:p/>
+        </w:tc>
+        <w:tc>
+          <w:tcPr>
+            <w:tcW w:type="dxa" w:w="1234"/>
+          </w:tcPr>
+          <w:p/>
+        </w:tc>
+        <w:tc>
+          <w:tcPr>
+            <w:tcW w:type="dxa" w:w="1234"/>
+          </w:tcPr>
+          <w:p/>
+        </w:tc>
+        <w:tc>
+          <w:tcPr>
+            <w:tcW w:type="dxa" w:w="1234"/>
+          </w:tcPr>
+          <w:p/>
+        </w:tc>
+        <w:tc>
+          <w:tcPr>
+            <w:tcW w:type="dxa" w:w="1234"/>
+          </w:tcPr>
+          <w:p/>
+        </w:tc>
+        <w:tc>
+          <w:tcPr>
+            <w:tcW w:type="dxa" w:w="1234"/>
+          </w:tcPr>
+          <w:p/>
+        </w:tc>
+        <w:tc>
+          <w:tcPr>
+            <w:tcW w:type="dxa" w:w="1234"/>
+          </w:tcPr>
           <w:p>
             <w:r>
               <w:t>1.4322</w:t>
@@ -1444,6 +4964,50 @@
           <w:tcPr>
             <w:tcW w:type="dxa" w:w="1234"/>
           </w:tcPr>
+          <w:p/>
+        </w:tc>
+        <w:tc>
+          <w:tcPr>
+            <w:tcW w:type="dxa" w:w="1234"/>
+          </w:tcPr>
+          <w:p/>
+        </w:tc>
+        <w:tc>
+          <w:tcPr>
+            <w:tcW w:type="dxa" w:w="1234"/>
+          </w:tcPr>
+          <w:p/>
+        </w:tc>
+        <w:tc>
+          <w:tcPr>
+            <w:tcW w:type="dxa" w:w="1234"/>
+          </w:tcPr>
+          <w:p/>
+        </w:tc>
+        <w:tc>
+          <w:tcPr>
+            <w:tcW w:type="dxa" w:w="1234"/>
+          </w:tcPr>
+          <w:p/>
+        </w:tc>
+        <w:tc>
+          <w:tcPr>
+            <w:tcW w:type="dxa" w:w="1234"/>
+          </w:tcPr>
+          <w:p/>
+        </w:tc>
+      </w:tr>
+      <w:tr>
+        <w:tc>
+          <w:tcPr>
+            <w:tcW w:type="dxa" w:w="1234"/>
+          </w:tcPr>
+          <w:p/>
+        </w:tc>
+        <w:tc>
+          <w:tcPr>
+            <w:tcW w:type="dxa" w:w="1234"/>
+          </w:tcPr>
           <w:p>
             <w:r>
               <w:t>time limit (1)</w:t>
@@ -1454,6 +5018,50 @@
           <w:tcPr>
             <w:tcW w:type="dxa" w:w="1234"/>
           </w:tcPr>
+          <w:p/>
+        </w:tc>
+        <w:tc>
+          <w:tcPr>
+            <w:tcW w:type="dxa" w:w="1234"/>
+          </w:tcPr>
+          <w:p/>
+        </w:tc>
+        <w:tc>
+          <w:tcPr>
+            <w:tcW w:type="dxa" w:w="1234"/>
+          </w:tcPr>
+          <w:p/>
+        </w:tc>
+        <w:tc>
+          <w:tcPr>
+            <w:tcW w:type="dxa" w:w="1234"/>
+          </w:tcPr>
+          <w:p/>
+        </w:tc>
+        <w:tc>
+          <w:tcPr>
+            <w:tcW w:type="dxa" w:w="1234"/>
+          </w:tcPr>
+          <w:p/>
+        </w:tc>
+      </w:tr>
+      <w:tr>
+        <w:tc>
+          <w:tcPr>
+            <w:tcW w:type="dxa" w:w="1234"/>
+          </w:tcPr>
+          <w:p/>
+        </w:tc>
+        <w:tc>
+          <w:tcPr>
+            <w:tcW w:type="dxa" w:w="1234"/>
+          </w:tcPr>
+          <w:p/>
+        </w:tc>
+        <w:tc>
+          <w:tcPr>
+            <w:tcW w:type="dxa" w:w="1234"/>
+          </w:tcPr>
           <w:p>
             <w:r>
               <w:t>60.5 s</w:t>
@@ -1464,6 +5072,50 @@
           <w:tcPr>
             <w:tcW w:type="dxa" w:w="1234"/>
           </w:tcPr>
+          <w:p/>
+        </w:tc>
+        <w:tc>
+          <w:tcPr>
+            <w:tcW w:type="dxa" w:w="1234"/>
+          </w:tcPr>
+          <w:p/>
+        </w:tc>
+        <w:tc>
+          <w:tcPr>
+            <w:tcW w:type="dxa" w:w="1234"/>
+          </w:tcPr>
+          <w:p/>
+        </w:tc>
+        <w:tc>
+          <w:tcPr>
+            <w:tcW w:type="dxa" w:w="1234"/>
+          </w:tcPr>
+          <w:p/>
+        </w:tc>
+      </w:tr>
+      <w:tr>
+        <w:tc>
+          <w:tcPr>
+            <w:tcW w:type="dxa" w:w="1234"/>
+          </w:tcPr>
+          <w:p/>
+        </w:tc>
+        <w:tc>
+          <w:tcPr>
+            <w:tcW w:type="dxa" w:w="1234"/>
+          </w:tcPr>
+          <w:p/>
+        </w:tc>
+        <w:tc>
+          <w:tcPr>
+            <w:tcW w:type="dxa" w:w="1234"/>
+          </w:tcPr>
+          <w:p/>
+        </w:tc>
+        <w:tc>
+          <w:tcPr>
+            <w:tcW w:type="dxa" w:w="1234"/>
+          </w:tcPr>
           <w:p>
             <w:r>
               <w:t>1.4207</w:t>
@@ -1474,6 +5126,50 @@
           <w:tcPr>
             <w:tcW w:type="dxa" w:w="1234"/>
           </w:tcPr>
+          <w:p/>
+        </w:tc>
+        <w:tc>
+          <w:tcPr>
+            <w:tcW w:type="dxa" w:w="1234"/>
+          </w:tcPr>
+          <w:p/>
+        </w:tc>
+        <w:tc>
+          <w:tcPr>
+            <w:tcW w:type="dxa" w:w="1234"/>
+          </w:tcPr>
+          <w:p/>
+        </w:tc>
+      </w:tr>
+      <w:tr>
+        <w:tc>
+          <w:tcPr>
+            <w:tcW w:type="dxa" w:w="1234"/>
+          </w:tcPr>
+          <w:p/>
+        </w:tc>
+        <w:tc>
+          <w:tcPr>
+            <w:tcW w:type="dxa" w:w="1234"/>
+          </w:tcPr>
+          <w:p/>
+        </w:tc>
+        <w:tc>
+          <w:tcPr>
+            <w:tcW w:type="dxa" w:w="1234"/>
+          </w:tcPr>
+          <w:p/>
+        </w:tc>
+        <w:tc>
+          <w:tcPr>
+            <w:tcW w:type="dxa" w:w="1234"/>
+          </w:tcPr>
+          <w:p/>
+        </w:tc>
+        <w:tc>
+          <w:tcPr>
+            <w:tcW w:type="dxa" w:w="1234"/>
+          </w:tcPr>
           <w:p>
             <w:r>
               <w:t>optimal (0)</w:t>
@@ -1484,6 +5180,50 @@
           <w:tcPr>
             <w:tcW w:type="dxa" w:w="1234"/>
           </w:tcPr>
+          <w:p/>
+        </w:tc>
+        <w:tc>
+          <w:tcPr>
+            <w:tcW w:type="dxa" w:w="1234"/>
+          </w:tcPr>
+          <w:p/>
+        </w:tc>
+      </w:tr>
+      <w:tr>
+        <w:tc>
+          <w:tcPr>
+            <w:tcW w:type="dxa" w:w="1234"/>
+          </w:tcPr>
+          <w:p/>
+        </w:tc>
+        <w:tc>
+          <w:tcPr>
+            <w:tcW w:type="dxa" w:w="1234"/>
+          </w:tcPr>
+          <w:p/>
+        </w:tc>
+        <w:tc>
+          <w:tcPr>
+            <w:tcW w:type="dxa" w:w="1234"/>
+          </w:tcPr>
+          <w:p/>
+        </w:tc>
+        <w:tc>
+          <w:tcPr>
+            <w:tcW w:type="dxa" w:w="1234"/>
+          </w:tcPr>
+          <w:p/>
+        </w:tc>
+        <w:tc>
+          <w:tcPr>
+            <w:tcW w:type="dxa" w:w="1234"/>
+          </w:tcPr>
+          <w:p/>
+        </w:tc>
+        <w:tc>
+          <w:tcPr>
+            <w:tcW w:type="dxa" w:w="1234"/>
+          </w:tcPr>
           <w:p>
             <w:r>
               <w:t>1.4515</w:t>
@@ -1494,6 +5234,50 @@
           <w:tcPr>
             <w:tcW w:type="dxa" w:w="1234"/>
           </w:tcPr>
+          <w:p/>
+        </w:tc>
+      </w:tr>
+      <w:tr>
+        <w:tc>
+          <w:tcPr>
+            <w:tcW w:type="dxa" w:w="1234"/>
+          </w:tcPr>
+          <w:p/>
+        </w:tc>
+        <w:tc>
+          <w:tcPr>
+            <w:tcW w:type="dxa" w:w="1234"/>
+          </w:tcPr>
+          <w:p/>
+        </w:tc>
+        <w:tc>
+          <w:tcPr>
+            <w:tcW w:type="dxa" w:w="1234"/>
+          </w:tcPr>
+          <w:p/>
+        </w:tc>
+        <w:tc>
+          <w:tcPr>
+            <w:tcW w:type="dxa" w:w="1234"/>
+          </w:tcPr>
+          <w:p/>
+        </w:tc>
+        <w:tc>
+          <w:tcPr>
+            <w:tcW w:type="dxa" w:w="1234"/>
+          </w:tcPr>
+          <w:p/>
+        </w:tc>
+        <w:tc>
+          <w:tcPr>
+            <w:tcW w:type="dxa" w:w="1234"/>
+          </w:tcPr>
+          <w:p/>
+        </w:tc>
+        <w:tc>
+          <w:tcPr>
+            <w:tcW w:type="dxa" w:w="1234"/>
+          </w:tcPr>
           <w:p>
             <w:r>
               <w:t>1.4515</w:t>
@@ -1504,7 +5288,7 @@
     </w:tbl>
     <w:p>
       <w:r>
-        <w:t>* these two solves needed a tighter optimality gap (1e-6 instead of the default 1e-4): the solver had already declared the run optimal, but the certificate stopped within 1e-4 of the bound, leaving the incumbent a hair below the greedy score.</w:t>
+        <w:t>* In these two rows, the solver required a tighter optimality tolerance (mip_rel_gap = 1e-6 instead of the default 1e-4). With the default tolerance, the solver returned an optimal status while terminating within 1e-4 of the bound, leaving an incumbent marginally below the greedy score.</w:t>
       </w:r>
     </w:p>
     <w:p>
@@ -1512,17 +5296,17 @@
         <w:pStyle w:val="Heading1"/>
       </w:pPr>
       <w:r>
-        <w:t>3. Same instance check</w:t>
+        <w:t>3. Confirmation that the same instances were evaluated</w:t>
       </w:r>
     </w:p>
     <w:p>
       <w:r>
-        <w:t>The sweeps do not load instance files -- each replication regenerates its instance deterministically from (sweep kind, parameter, seed), so all four methods always run on the identical generated object inside one evaluate() call. To be certain the rebuilt instances matched the recorded runs, I compared each rebuilt instance's max-accuracy bound against the bound column stored in the CSVs: all 9 flagged instances matched to 9 decimal places (see milp_diagnostics.csv, instance_check column). Not a different-instances problem.</w:t>
+        <w:t>Because the sweeps regenerate instances rather than loading saved files, each replication is determined entirely by (sweep kind, parameter, seed). Within a single evaluate() call, all methods operate on the same generated object. To verify that the diagnostic reruns reconstructed the instances used in the original sweeps, the max-accuracy bound computed for each rebuilt instance was compared to the bound stored in the CSV outputs. Across all nine flagged instances, these bounds agreed to 9 decimal places (see milp_diagnostics.csv, instance_check column), indicating that the differences cannot be explained by evaluating different instances across methods.</w:t>
       </w:r>
     </w:p>
     <w:p>
       <w:r>
-        <w:t>For completeness, the per-dataset test runs in data/results/test_runs.csv were checked too: on those instances the MILP is never below any other method (small and medium both sit on the bound together with greedy).</w:t>
+        <w:t>The per-dataset test runs in data/results/test_runs.csv were also reviewed. In those experiments, the MILP is never below any other method, and for both the small and medium datasets, the MILP and greedy match the bound.</w:t>
       </w:r>
     </w:p>
     <w:p>
@@ -1530,12 +5314,22 @@
         <w:pStyle w:val="Heading1"/>
       </w:pPr>
       <w:r>
-        <w:t>4. The cause</w:t>
+        <w:t>4. Cause of the discrepancy</w:t>
       </w:r>
     </w:p>
     <w:p>
       <w:r>
-        <w:t>Two separate causes, both numerical rather than methodological. First, the 60 s solver time limit: eight of the nine flagged runs ended with solver status 1 (time limit reached) and a positive MIP gap of 0.2-2.2 percent. HiGHS was still improving the incumbent when the clock stopped it, so the recorded score is a truncated incumbent, not the optimum. Given 300 s, every one of those instances certifies optimality (status 0, gap 0) and lands exactly on the bound, at or above the greedy score. Second, the mip_rel_gap tolerance: two runs finished 'optimal' but stopped within the default 1e-4 relative gap, leaving the incumbent about 1e-4 below the bound -- a rounding-level difference that read as 'greedy beats MILP' in the table. A 1e-6 gap closes those to the bound. Not a bug in the model, and not a case of different instances across methods.</w:t>
+        <w:t>The apparent cases where greedy outperforms the MILP are explained by numerical factors, not by a methodological difference, a modeling error, or an instance mismatch.</w:t>
+      </w:r>
+    </w:p>
+    <w:p>
+      <w:r>
+        <w:t>The primary driver is truncation under the original 60 s time limit. Eight of the nine flagged MILP runs ended with status 1 (time limit reached) and retained a positive MIP gap between 0.2 and 2.2 percent. In those runs, HiGHS was still improving the incumbent when the time limit stopped the search, so the reported value is a time-limited incumbent rather than the optimum. When the same instances are instead solved for 300 s, each run certifies optimality (status 0, gap 0) and reaches the bound, which matches or exceeds the greedy score.</w:t>
+      </w:r>
+    </w:p>
+    <w:p>
+      <w:r>
+        <w:t>A second effect appears in two cases where the solver reported an 'optimal' status under the default mip_rel_gap = 1e-4. Because termination is allowed within that relative tolerance, the incumbent can remain roughly 1e-4 below the bound, which is sufficient to show up as 'greedy beats MILP' in the tables. Reducing the tolerance to mip_rel_gap = 1e-6 removes this rounding-scale separation and returns solutions on the bound.</w:t>
       </w:r>
     </w:p>
     <w:p>
@@ -1543,17 +5337,17 @@
         <w:pStyle w:val="Heading1"/>
       </w:pPr>
       <w:r>
-        <w:t>5. The fix</w:t>
+        <w:t>5. Applied correction</w:t>
       </w:r>
     </w:p>
     <w:p>
       <w:r>
-        <w:t>Every MILP run that finished below another method on the same instance was re-solved at a 300 s time limit with mip_rel_gap=1e-6 (revisions/fix_flagged_milp.py). The affected rows in slack.csv, nodes.csv, size.csv, failure.csv, and bandwidth.csv were updated with the certified scores, makespans, feasibility flags, and run times, and all five sweep figures were regenerated (data/results/figures/, copied into paper/Figures/).</w:t>
+        <w:t>For every instance where the MILP score fell below another method, the MILP was re-solved with a 300 s time limit and mip_rel_gap = 1e-6 (revisions/fix_flagged_milp.py). The resulting certified outputs were written back to slack.csv, nodes.csv, size.csv, failure.csv, and bandwidth.csv, updating scores, makespans, feasibility flags, and run times. All five sweep figures were then regenerated (data/results/figures/) and copied into paper/Figures/.</w:t>
       </w:r>
     </w:p>
     <w:p>
       <w:r>
-        <w:t>Verification after the fix: a scan of every sweep CSV finds zero rows where rounding, greedy, or GA outscore the MILP on the same instance. At alpha=1.2 and 1.3 the MILP and greedy now coincide on the bound, and at N=10 and n=100 the MILP sits on the bound as the text already claimed.</w:t>
+        <w:t>After these updates, a full scan of the sweep CSVs finds no rows where rounding, greedy, or GA exceed the MILP on the same instance. For alpha = 1.2 and 1.3, the MILP and greedy now coincide at the bound. The same holds for N = 10 and n = 100, where the MILP also lies on the bound, aligning with the claims in the paper.</w:t>
       </w:r>
     </w:p>
     <w:p>
@@ -1561,12 +5355,12 @@
         <w:pStyle w:val="Heading1"/>
       </w:pPr>
       <w:r>
-        <w:t>6. What changed in the paper</w:t>
+        <w:t>6. Paper revisions</w:t>
       </w:r>
     </w:p>
     <w:p>
       <w:r>
-        <w:t>The experimental setup now discloses the 60 s first-pass limit and the 300 s / 1e-6 certification re-solves, Section V-B's slack discussion states that the MILP reaches the bound from alpha=1.2 (matching the regenerated figure), the bottlenecks paragraph references the certification limit, and the notebook documents the re-solve. The deadline-slack figure changed slightly: the MILP curve at alpha=1.2-1.5 now sits on the bound instead of a hair below it.</w:t>
+        <w:t>The experimental description was updated to reflect both the initial 60 s MILP solve limit and the subsequent 300 s / 1e-6 certification reruns. Section V-B now states that, in the deadline-slack sweep, the MILP reaches the bound from alpha = 1.2, consistent with the regenerated plot. The bottlenecks paragraph now references the certification limit, and the notebook documents the re-solve procedure. The deadline-slack figure changed slightly: for alpha = 1.2 through 1.5, the MILP curve now lies on the bound rather than appearing marginally below it.</w:t>
       </w:r>
     </w:p>
     <w:sectPr>

</xml_diff>

<commit_message>
Rewrite MILP report in plain language with terms explained
</commit_message>
<xml_diff>
--- a/revisions/MILP_vs_heuristic_analysis.docx
+++ b/revisions/MILP_vs_heuristic_analysis.docx
@@ -12,7 +12,12 @@
     </w:p>
     <w:p>
       <w:r>
-        <w:t>This review re-examined the accuracy results reported in the data-aware scheduling paper with the specific aim of explaining the few cases where a heuristic appears to exceed the MILP. The approach was to enumerate every same-instance comparison in which the heuristic score was higher, rerun the MILP on those exact instances, and trace the discrepancy to its source. All values and comparisons referenced here come from data/results/*.csv and from the diagnostic reruns produced in this folder (diagnose_milp_gap.py, fix_flagged_milp.py, milp_diagnostics.csv).</w:t>
+        <w:t>The figures in the paper contain a few points where a heuristic method appears to score higher than the MILP. Since the MILP solves the model exactly, a heuristic should never beat it on the same problem, so this needed an explanation. This note lists every such case, reruns the MILP on the same instances, and identifies the cause. All numbers below come from the result files in data/results/ and from the diagnostic reruns stored in this folder (diagnose_milp_gap.py, fix_flagged_milp.py, milp_diagnostics.csv).</w:t>
+      </w:r>
+    </w:p>
+    <w:p>
+      <w:r>
+        <w:t>A quick note on terms. Each experiment in the paper varies one setting at a time - deadline slack, number of fog nodes, workflow size, failure rate, or link bandwidth. For each setting we run five repetitions, each on a freshly generated problem instance. The generator uses a fixed random seed for each repetition (seeds 0, 1000, 2000, 3000, 4000), so asking for the same settings always produces the identical instance. In the tables below, 'rep' means which of the five repetitions a row belongs to.</w:t>
       </w:r>
     </w:p>
     <w:p>
@@ -20,12 +25,12 @@
         <w:pStyle w:val="Heading1"/>
       </w:pPr>
       <w:r>
-        <w:t>1. Instances where a heuristic exceeded the MILP</w:t>
+        <w:t>1. Points where a heuristic scored higher</w:t>
       </w:r>
     </w:p>
     <w:p>
       <w:r>
-        <w:t>In Figure 4 (deadline slack) and Figure 5 (federation size), a small number of plotted points place the greedy marker slightly above the MILP marker. To rule out averaging artifacts, the review inspected the full sweep CSVs at the row level, rather than relying on the plotted means. The following table lists every case where a like-for-like heuristic scored above the MILP on the same generated instance.</w:t>
+        <w:t>In the deadline-slack figure (Figure 4) and the federation-size figure (Figure 5), a few points place the greedy marker slightly above the MILP marker. The figures show averages, so I went back to the raw result files and compared methods instance by instance. Every case where a directly comparable method scored above the MILP on the same instance is listed here:</w:t>
       </w:r>
     </w:p>
     <w:tbl>
@@ -48,7 +53,7 @@
           </w:tcPr>
           <w:p>
             <w:r>
-              <w:t>Sweep</w:t>
+              <w:t>Experiment</w:t>
             </w:r>
           </w:p>
         </w:tc>
@@ -58,7 +63,7 @@
           </w:tcPr>
           <w:p>
             <w:r>
-              <w:t>Parameter</w:t>
+              <w:t>Setting</w:t>
             </w:r>
           </w:p>
         </w:tc>
@@ -100,7 +105,7 @@
           </w:tcPr>
           <w:p>
             <w:r>
-              <w:t>slack (Fig. 4)</w:t>
+              <w:t>deadline slack (Fig. 4)</w:t>
             </w:r>
           </w:p>
         </w:tc>
@@ -280,7 +285,7 @@
           </w:tcPr>
           <w:p>
             <w:r>
-              <w:t>slack (Fig. 4)</w:t>
+              <w:t>deadline slack (Fig. 4)</w:t>
             </w:r>
           </w:p>
         </w:tc>
@@ -460,7 +465,7 @@
           </w:tcPr>
           <w:p>
             <w:r>
-              <w:t>slack (Fig. 4)</w:t>
+              <w:t>deadline slack (Fig. 4)</w:t>
             </w:r>
           </w:p>
         </w:tc>
@@ -640,7 +645,7 @@
           </w:tcPr>
           <w:p>
             <w:r>
-              <w:t>slack (Fig. 4)</w:t>
+              <w:t>deadline slack (Fig. 4)</w:t>
             </w:r>
           </w:p>
         </w:tc>
@@ -820,7 +825,7 @@
           </w:tcPr>
           <w:p>
             <w:r>
-              <w:t>slack (Fig. 4)</w:t>
+              <w:t>deadline slack (Fig. 4)</w:t>
             </w:r>
           </w:p>
         </w:tc>
@@ -1000,7 +1005,7 @@
           </w:tcPr>
           <w:p>
             <w:r>
-              <w:t>nodes (Fig. 5)</w:t>
+              <w:t>federation size (Fig. 5)</w:t>
             </w:r>
           </w:p>
         </w:tc>
@@ -1180,7 +1185,7 @@
           </w:tcPr>
           <w:p>
             <w:r>
-              <w:t>nodes (Fig. 5)</w:t>
+              <w:t>federation size (Fig. 5)</w:t>
             </w:r>
           </w:p>
         </w:tc>
@@ -1360,7 +1365,7 @@
           </w:tcPr>
           <w:p>
             <w:r>
-              <w:t>size (Fig. 6)</w:t>
+              <w:t>workflow size (Fig. 6)</w:t>
             </w:r>
           </w:p>
         </w:tc>
@@ -1540,7 +1545,7 @@
           </w:tcPr>
           <w:p>
             <w:r>
-              <w:t>failure (Fig. 7)</w:t>
+              <w:t>task failures (Fig. 7)</w:t>
             </w:r>
           </w:p>
         </w:tc>
@@ -1720,7 +1725,7 @@
           </w:tcPr>
           <w:p>
             <w:r>
-              <w:t>bandwidth (Fig. 8)</w:t>
+              <w:t>link bandwidth (Fig. 8)</w:t>
             </w:r>
           </w:p>
         </w:tc>
@@ -1900,7 +1905,7 @@
           </w:tcPr>
           <w:p>
             <w:r>
-              <w:t>bandwidth (Fig. 8)</w:t>
+              <w:t>link bandwidth (Fig. 8)</w:t>
             </w:r>
           </w:p>
         </w:tc>
@@ -2076,7 +2081,7 @@
     </w:tbl>
     <w:p>
       <w:r>
-        <w:t>Two clarifications are necessary for interpreting this list. The failure-sweep entry at rep 1 appears under all six failure rates because each rate is evaluated on the same generated instance, so this corresponds to a single instance rather than six distinct ones. That same default instance also underlies slack alpha = 1.5 rep 1, failure rep 1, and bandwidth scale = 1.0 rep 1. In addition, although the bandwidth-blind baseline can exceed the MILP under degraded bandwidth, it is not a like-for-like comparator because it ignores transfer costs, so it is not included here.</w:t>
+        <w:t>Two things in this list need a word of explanation. The failure experiment entry at repetition 1 shows up at all six failure rates because every rate is tested on the same generated instance - it is one instance, not six. That same default instance is also behind the slack alpha = 1.5 repetition-1 row and the bandwidth scale = 1.0 repetition-1 row. Separately, the bandwidth-blind baseline also scores above the MILP at heavily degraded bandwidths, but it is not a fair comparison - that baseline picks its placements as if transfers were free - so it is left out of this list.</w:t>
       </w:r>
     </w:p>
     <w:p>
@@ -2166,12 +2171,12 @@
         <w:pStyle w:val="Heading1"/>
       </w:pPr>
       <w:r>
-        <w:t>2. Diagnostic MILP reruns for the flagged points</w:t>
+        <w:t>2. Rerunning the MILP on the flagged instances</w:t>
       </w:r>
     </w:p>
     <w:p>
       <w:r>
-        <w:t>To reproduce each flagged comparison, the corresponding instance was regenerated deterministically using the identical sweep arguments and seed (seed = 1000 x rep; defaults are 50 tasks, 5 nodes, alpha = 1.5 unless overridden by the sweep axis). The MILP was then solved twice per instance: first using the original 60 s limit, and again with a 300 s time limit. The table below reports the solver status, wall time, and resulting scores.</w:t>
+        <w:t>For each case in the table, I regenerated the instance exactly as the experiment had built it and solved the MILP twice: once with the original 60-second time limit, and once with a 300-second limit. For every solve I recorded the solver status (whether it proved optimality or stopped at the time limit), the actual runtime, and the final score.</w:t>
       </w:r>
     </w:p>
     <w:tbl>
@@ -2216,7 +2221,7 @@
           </w:tcPr>
           <w:p>
             <w:r>
-              <w:t>60 s wall</w:t>
+              <w:t>60 s time</w:t>
             </w:r>
           </w:p>
         </w:tc>
@@ -2268,7 +2273,7 @@
           </w:tcPr>
           <w:p>
             <w:r>
-              <w:t>slack 1.2 r2</w:t>
+              <w:t>slack 1.2 rep 2</w:t>
             </w:r>
           </w:p>
         </w:tc>
@@ -2322,7 +2327,7 @@
           </w:tcPr>
           <w:p>
             <w:r>
-              <w:t>time limit (1)</w:t>
+              <w:t>time limit</w:t>
             </w:r>
           </w:p>
         </w:tc>
@@ -2484,7 +2489,7 @@
           </w:tcPr>
           <w:p>
             <w:r>
-              <w:t>optimal (0)</w:t>
+              <w:t>optimal</w:t>
             </w:r>
           </w:p>
         </w:tc>
@@ -2604,7 +2609,7 @@
           </w:tcPr>
           <w:p>
             <w:r>
-              <w:t>slack 1.2 r3</w:t>
+              <w:t>slack 1.2 rep 3</w:t>
             </w:r>
           </w:p>
         </w:tc>
@@ -2658,7 +2663,7 @@
           </w:tcPr>
           <w:p>
             <w:r>
-              <w:t>time limit (1)</w:t>
+              <w:t>time limit</w:t>
             </w:r>
           </w:p>
         </w:tc>
@@ -2820,7 +2825,7 @@
           </w:tcPr>
           <w:p>
             <w:r>
-              <w:t>optimal (0)</w:t>
+              <w:t>optimal</w:t>
             </w:r>
           </w:p>
         </w:tc>
@@ -2940,7 +2945,7 @@
           </w:tcPr>
           <w:p>
             <w:r>
-              <w:t>slack 1.2 r4</w:t>
+              <w:t>slack 1.2 rep 4</w:t>
             </w:r>
           </w:p>
         </w:tc>
@@ -2994,7 +2999,7 @@
           </w:tcPr>
           <w:p>
             <w:r>
-              <w:t>time limit (1)</w:t>
+              <w:t>time limit</w:t>
             </w:r>
           </w:p>
         </w:tc>
@@ -3156,7 +3161,7 @@
           </w:tcPr>
           <w:p>
             <w:r>
-              <w:t>optimal (0)</w:t>
+              <w:t>optimal</w:t>
             </w:r>
           </w:p>
         </w:tc>
@@ -3276,7 +3281,7 @@
           </w:tcPr>
           <w:p>
             <w:r>
-              <w:t>slack 1.3 r3</w:t>
+              <w:t>slack 1.3 rep 3</w:t>
             </w:r>
           </w:p>
         </w:tc>
@@ -3330,7 +3335,7 @@
           </w:tcPr>
           <w:p>
             <w:r>
-              <w:t>time limit (1)</w:t>
+              <w:t>time limit</w:t>
             </w:r>
           </w:p>
         </w:tc>
@@ -3492,7 +3497,7 @@
           </w:tcPr>
           <w:p>
             <w:r>
-              <w:t>optimal (0)</w:t>
+              <w:t>optimal</w:t>
             </w:r>
           </w:p>
         </w:tc>
@@ -3612,7 +3617,7 @@
           </w:tcPr>
           <w:p>
             <w:r>
-              <w:t>slack 1.5 r1</w:t>
+              <w:t>slack 1.5 rep 1</w:t>
             </w:r>
           </w:p>
         </w:tc>
@@ -3666,7 +3671,7 @@
           </w:tcPr>
           <w:p>
             <w:r>
-              <w:t>optimal (0)</w:t>
+              <w:t>optimal</w:t>
             </w:r>
           </w:p>
         </w:tc>
@@ -3828,7 +3833,7 @@
           </w:tcPr>
           <w:p>
             <w:r>
-              <w:t>optimal (0)</w:t>
+              <w:t>optimal</w:t>
             </w:r>
           </w:p>
         </w:tc>
@@ -3948,7 +3953,7 @@
           </w:tcPr>
           <w:p>
             <w:r>
-              <w:t>nodes 10 r0</w:t>
+              <w:t>nodes 10 rep 0</w:t>
             </w:r>
           </w:p>
         </w:tc>
@@ -4002,7 +4007,7 @@
           </w:tcPr>
           <w:p>
             <w:r>
-              <w:t>time limit (1)</w:t>
+              <w:t>time limit</w:t>
             </w:r>
           </w:p>
         </w:tc>
@@ -4164,7 +4169,7 @@
           </w:tcPr>
           <w:p>
             <w:r>
-              <w:t>optimal (0)</w:t>
+              <w:t>optimal</w:t>
             </w:r>
           </w:p>
         </w:tc>
@@ -4284,7 +4289,7 @@
           </w:tcPr>
           <w:p>
             <w:r>
-              <w:t>nodes 10 r3</w:t>
+              <w:t>nodes 10 rep 3</w:t>
             </w:r>
           </w:p>
         </w:tc>
@@ -4338,7 +4343,7 @@
           </w:tcPr>
           <w:p>
             <w:r>
-              <w:t>optimal (0)</w:t>
+              <w:t>optimal</w:t>
             </w:r>
           </w:p>
         </w:tc>
@@ -4500,7 +4505,7 @@
           </w:tcPr>
           <w:p>
             <w:r>
-              <w:t>optimal (0)</w:t>
+              <w:t>optimal</w:t>
             </w:r>
           </w:p>
         </w:tc>
@@ -4620,7 +4625,7 @@
           </w:tcPr>
           <w:p>
             <w:r>
-              <w:t>size 100 r4</w:t>
+              <w:t>size 100 rep 4</w:t>
             </w:r>
           </w:p>
         </w:tc>
@@ -4674,7 +4679,7 @@
           </w:tcPr>
           <w:p>
             <w:r>
-              <w:t>time limit (1)</w:t>
+              <w:t>time limit</w:t>
             </w:r>
           </w:p>
         </w:tc>
@@ -4836,7 +4841,7 @@
           </w:tcPr>
           <w:p>
             <w:r>
-              <w:t>optimal (0)</w:t>
+              <w:t>optimal</w:t>
             </w:r>
           </w:p>
         </w:tc>
@@ -4956,7 +4961,7 @@
           </w:tcPr>
           <w:p>
             <w:r>
-              <w:t>bandwidth 0.2 r4</w:t>
+              <w:t>bandwidth 0.2 rep 4</w:t>
             </w:r>
           </w:p>
         </w:tc>
@@ -5010,7 +5015,7 @@
           </w:tcPr>
           <w:p>
             <w:r>
-              <w:t>time limit (1)</w:t>
+              <w:t>time limit</w:t>
             </w:r>
           </w:p>
         </w:tc>
@@ -5172,7 +5177,7 @@
           </w:tcPr>
           <w:p>
             <w:r>
-              <w:t>optimal (0)</w:t>
+              <w:t>optimal</w:t>
             </w:r>
           </w:p>
         </w:tc>
@@ -5288,7 +5293,7 @@
     </w:tbl>
     <w:p>
       <w:r>
-        <w:t>* In these two rows, the solver required a tighter optimality tolerance (mip_rel_gap = 1e-6 instead of the default 1e-4). With the default tolerance, the solver returned an optimal status while terminating within 1e-4 of the bound, leaving an incumbent marginally below the greedy score.</w:t>
+        <w:t>* These two solves needed a tighter stopping rule than the default. The solver stops when the best solution found is provably within a small fraction of the true optimum - by default 1e-4 (0.01%). On these instances it stopped with a solution about 1e-4 below the bound, which was just enough to show up as 'below the greedy'. Tightening the rule to 1e-6 (0.0001%) pushed the result up to the bound.</w:t>
       </w:r>
     </w:p>
     <w:p>
@@ -5296,17 +5301,17 @@
         <w:pStyle w:val="Heading1"/>
       </w:pPr>
       <w:r>
-        <w:t>3. Confirmation that the same instances were evaluated</w:t>
+        <w:t>3. Checking that the same instances were used</w:t>
       </w:r>
     </w:p>
     <w:p>
       <w:r>
-        <w:t>Because the sweeps regenerate instances rather than loading saved files, each replication is determined entirely by (sweep kind, parameter, seed). Within a single evaluate() call, all methods operate on the same generated object. To verify that the diagnostic reruns reconstructed the instances used in the original sweeps, the max-accuracy bound computed for each rebuilt instance was compared to the bound stored in the CSV outputs. Across all nine flagged instances, these bounds agreed to 9 decimal places (see milp_diagnostics.csv, instance_check column), indicating that the differences cannot be explained by evaluating different instances across methods.</w:t>
+        <w:t>The experiments do not load instances from files - each repetition generates its instance on the spot from the seed, and all four methods are run on that one generated object. So by construction they could not have seen different data. To be extra sure that my reruns rebuilt the same instances the sweeps had used, I compared each rebuilt instance's accuracy bound (the score obtained when every task runs in full) against the bound recorded in the result files. On all nine flagged instances the bounds matched to nine decimal places. The differences are therefore not explained by methods seeing different instances.</w:t>
       </w:r>
     </w:p>
     <w:p>
       <w:r>
-        <w:t>The per-dataset test runs in data/results/test_runs.csv were also reviewed. In those experiments, the MILP is never below any other method, and for both the small and medium datasets, the MILP and greedy match the bound.</w:t>
+        <w:t>I also checked the per-dataset test runs in test_runs.csv. On those fixed datasets the MILP never scores below any other method: on the small and medium datasets it sits on the bound together with the greedy.</w:t>
       </w:r>
     </w:p>
     <w:p>
@@ -5314,22 +5319,22 @@
         <w:pStyle w:val="Heading1"/>
       </w:pPr>
       <w:r>
-        <w:t>4. Cause of the discrepancy</w:t>
+        <w:t>4. What caused it</w:t>
       </w:r>
     </w:p>
     <w:p>
       <w:r>
-        <w:t>The apparent cases where greedy outperforms the MILP are explained by numerical factors, not by a methodological difference, a modeling error, or an instance mismatch.</w:t>
+        <w:t>The answer is two numerical effects inside the solver, not a bug in the model and not a difference between instances.</w:t>
       </w:r>
     </w:p>
     <w:p>
       <w:r>
-        <w:t>The primary driver is truncation under the original 60 s time limit. Eight of the nine flagged MILP runs ended with status 1 (time limit reached) and retained a positive MIP gap between 0.2 and 2.2 percent. In those runs, HiGHS was still improving the incumbent when the time limit stopped the search, so the reported value is a time-limited incumbent rather than the optimum. When the same instances are instead solved for 300 s, each run certifies optimality (status 0, gap 0) and reaches the bound, which matches or exceeds the greedy score.</w:t>
+        <w:t>The main effect is the time limit. Eight of the nine flagged MILP runs stopped because their 60 seconds ran out, not because they had finished. In each of those runs the solver still had an open gap - between 0.2% and 2.2% - between the best schedule it had found and the best it could prove exists. In other words, the number recorded in the table was the best answer found so far, not the best answer. Given 300 seconds, every one of those instances was solved to proven optimality, and the score landed exactly on the bound - level with the greedy, never below it.</w:t>
       </w:r>
     </w:p>
     <w:p>
       <w:r>
-        <w:t>A second effect appears in two cases where the solver reported an 'optimal' status under the default mip_rel_gap = 1e-4. Because termination is allowed within that relative tolerance, the incumbent can remain roughly 1e-4 below the bound, which is sufficient to show up as 'greedy beats MILP' in the tables. Reducing the tolerance to mip_rel_gap = 1e-6 removes this rounding-scale separation and returns solutions on the bound.</w:t>
+        <w:t>The second effect is the solver's stopping tolerance. In two runs the solver genuinely declared the solution 'optimal', but its stopping rule allows the certified answer to be within 0.01% of the true optimum. The recorded score sat about that much below the bound - small enough to look like a tie, but technically below the greedy score in the table. Tightening the tolerance to 0.0001% closed that hairline gap.</w:t>
       </w:r>
     </w:p>
     <w:p>
@@ -5337,17 +5342,17 @@
         <w:pStyle w:val="Heading1"/>
       </w:pPr>
       <w:r>
-        <w:t>5. Applied correction</w:t>
+        <w:t>5. What was changed</w:t>
       </w:r>
     </w:p>
     <w:p>
       <w:r>
-        <w:t>For every instance where the MILP score fell below another method, the MILP was re-solved with a 300 s time limit and mip_rel_gap = 1e-6 (revisions/fix_flagged_milp.py). The resulting certified outputs were written back to slack.csv, nodes.csv, size.csv, failure.csv, and bandwidth.csv, updating scores, makespans, feasibility flags, and run times. All five sweep figures were then regenerated (data/results/figures/) and copied into paper/Figures/.</w:t>
+        <w:t>Every instance where the MILP had finished below another method was re-solved with a 300-second limit and the tighter stopping rule (the script is revisions/fix_flagged_milp.py). The corrected scores, runtimes, and feasibility flags were written back into the five result files (slack, nodes, size, failure, bandwidth), and all five experiment figures were regenerated from the updated data and copied into the paper's Figures folder.</w:t>
       </w:r>
     </w:p>
     <w:p>
       <w:r>
-        <w:t>After these updates, a full scan of the sweep CSVs finds no rows where rounding, greedy, or GA exceed the MILP on the same instance. For alpha = 1.2 and 1.3, the MILP and greedy now coincide at the bound. The same holds for N = 10 and n = 100, where the MILP also lies on the bound, aligning with the claims in the paper.</w:t>
+        <w:t>After the update, scanning every result file confirms that no instance remains where rounding, the greedy, or the genetic algorithm scores above the MILP. In the slack experiment the MILP now sits exactly on the bound from alpha = 1.2 upward, as does the greedy. The federation-size and workflow-size figures changed the same way - the MILP marker now lies on the bound everywhere the text claimed it did.</w:t>
       </w:r>
     </w:p>
     <w:p>
@@ -5355,12 +5360,12 @@
         <w:pStyle w:val="Heading1"/>
       </w:pPr>
       <w:r>
-        <w:t>6. Paper revisions</w:t>
+        <w:t>6. What changed in the paper</w:t>
       </w:r>
     </w:p>
     <w:p>
       <w:r>
-        <w:t>The experimental description was updated to reflect both the initial 60 s MILP solve limit and the subsequent 300 s / 1e-6 certification reruns. Section V-B now states that, in the deadline-slack sweep, the MILP reaches the bound from alpha = 1.2, consistent with the regenerated plot. The bottlenecks paragraph now references the certification limit, and the notebook documents the re-solve procedure. The deadline-slack figure changed slightly: for alpha = 1.2 through 1.5, the MILP curve now lies on the bound rather than appearing marginally below it.</w:t>
+        <w:t>The experimental setup now states both limits: the MILP is first solved with a 60-second time limit, and any run that finished below a heuristic was re-solved with a 300-second limit and the tighter tolerance, with the certified scores being the ones reported. The slack-results paragraph now says the MILP reaches the bound from alpha = 1.2 onward, matching the regenerated figure. The limitations paragraph and the companion notebook were updated to document this re-solve step. Visually, the only change a reader will notice is in the deadline-slack figure: the MILP curve no longer sits a hair below the bound at the middle slack values - it lies on it.</w:t>
       </w:r>
     </w:p>
     <w:sectPr>

</xml_diff>

<commit_message>
Organize task-01 results; remove 'sweep' wording from paper and notebook
- revisions/results/task-01/ now holds the diagnostics CSV and the
  regenerated figures for the MILP investigation
- docx report embeds the task-01 figure copies and lists every produced
  file with its path
- paper/main.tex: replace 'sweep' with 'experiment'/'varied parameter'
  throughout; notebook markdown updated the same way (the literal
  fogsim.py sweep command is unchanged)
- recompiled main.pdf
</commit_message>
<xml_diff>
--- a/revisions/MILP_vs_heuristic_analysis.docx
+++ b/revisions/MILP_vs_heuristic_analysis.docx
@@ -5366,6 +5366,83 @@
     <w:p>
       <w:r>
         <w:t>The experimental setup now states both limits: the MILP is first solved with a 60-second time limit, and any run that finished below a heuristic was re-solved with a 300-second limit and the tighter tolerance, with the certified scores being the ones reported. The slack-results paragraph now says the MILP reaches the bound from alpha = 1.2 onward, matching the regenerated figure. The limitations paragraph and the companion notebook were updated to document this re-solve step. Visually, the only change a reader will notice is in the deadline-slack figure: the MILP curve no longer sits a hair below the bound at the middle slack values - it lies on it.</w:t>
+      </w:r>
+    </w:p>
+    <w:p>
+      <w:pPr>
+        <w:pStyle w:val="Heading1"/>
+      </w:pPr>
+      <w:r>
+        <w:t>Files produced for this task</w:t>
+      </w:r>
+    </w:p>
+    <w:p>
+      <w:r>
+        <w:t>Everything from this investigation is stored under revisions/results/task-01/ and is fully reproducible:</w:t>
+      </w:r>
+    </w:p>
+    <w:p>
+      <w:pPr>
+        <w:pStyle w:val="ListBullet"/>
+      </w:pPr>
+      <w:r>
+        <w:t>revisions/results/task-01/milp_diagnostics.csv - per-instance solver status, runtime, gap, and scores for every flagged point</w:t>
+      </w:r>
+    </w:p>
+    <w:p>
+      <w:pPr>
+        <w:pStyle w:val="ListBullet"/>
+      </w:pPr>
+      <w:r>
+        <w:t>revisions/results/task-01/perf_slack_accuracy.png - Figure 4, regenerated from the corrected results (also copied to paper/Figures/perf_slack_accuracy.png)</w:t>
+      </w:r>
+    </w:p>
+    <w:p>
+      <w:pPr>
+        <w:pStyle w:val="ListBullet"/>
+      </w:pPr>
+      <w:r>
+        <w:t>revisions/results/task-01/perf_nodes_accuracy.png - Figure 5, regenerated (also in paper/Figures/perf_nodes_accuracy.png)</w:t>
+      </w:r>
+    </w:p>
+    <w:p>
+      <w:pPr>
+        <w:pStyle w:val="ListBullet"/>
+      </w:pPr>
+      <w:r>
+        <w:t>revisions/results/task-01/perf_bandwidth_accuracy.png - the bandwidth experiment figure (also in paper/Figures/)</w:t>
+      </w:r>
+    </w:p>
+    <w:p>
+      <w:pPr>
+        <w:pStyle w:val="ListBullet"/>
+      </w:pPr>
+      <w:r>
+        <w:t>revisions/diagnose_milp_gap.py - the diagnostic script that rebuilds each flagged instance and reruns the MILP at both limits</w:t>
+      </w:r>
+    </w:p>
+    <w:p>
+      <w:pPr>
+        <w:pStyle w:val="ListBullet"/>
+      </w:pPr>
+      <w:r>
+        <w:t>revisions/fix_flagged_milp.py - the correction script that re-solves flagged rows and rewrites the result files</w:t>
+      </w:r>
+    </w:p>
+    <w:p>
+      <w:pPr>
+        <w:pStyle w:val="ListBullet"/>
+      </w:pPr>
+      <w:r>
+        <w:t>data/results/test_runs.csv - the fixed per-dataset test runs (unchanged; the MILP was never below another method there)</w:t>
+      </w:r>
+    </w:p>
+    <w:p>
+      <w:pPr>
+        <w:pStyle w:val="ListBullet"/>
+      </w:pPr>
+      <w:r>
+        <w:t>data/results/slack.csv, nodes.csv, size.csv, failure.csv, bandwidth.csv - the five experiment result files with the certified MILP scores written back</w:t>
       </w:r>
     </w:p>
     <w:sectPr>

</xml_diff>